<commit_message>
finished lab1 lab2 opi
</commit_message>
<xml_diff>
--- a/OPI/lab1/report.docx
+++ b/OPI/lab1/report.docx
@@ -2253,7 +2253,7 @@
             <w:noProof/>
             <w:webHidden/>
           </w:rPr>
-          <w:t>29</w:t>
+          <w:t>31</w:t>
         </w:r>
         <w:r>
           <w:rPr>
@@ -2328,7 +2328,7 @@
             <w:noProof/>
             <w:webHidden/>
           </w:rPr>
-          <w:t>29</w:t>
+          <w:t>31</w:t>
         </w:r>
         <w:r>
           <w:rPr>
@@ -28151,10 +28151,2325 @@
     </w:p>
     <w:p>
       <w:pPr>
+        <w:rPr>
+          <w:rFonts w:cs="Times New Roman"/>
+          <w:szCs w:val="24"/>
+        </w:rPr>
+      </w:pPr>
+    </w:p>
+    <w:tbl>
+      <w:tblPr>
+        <w:tblW w:w="8882" w:type="dxa"/>
+        <w:jc w:val="center"/>
+        <w:tblCellMar>
+          <w:left w:w="98" w:type="dxa"/>
+        </w:tblCellMar>
+        <w:tblLook w:val="04A0" w:firstRow="1" w:lastRow="0" w:firstColumn="1" w:lastColumn="0" w:noHBand="0" w:noVBand="1"/>
+      </w:tblPr>
+      <w:tblGrid>
+        <w:gridCol w:w="8882"/>
+      </w:tblGrid>
+      <w:tr>
+        <w:trPr>
+          <w:trHeight w:val="465"/>
+          <w:jc w:val="center"/>
+        </w:trPr>
+        <w:tc>
+          <w:tcPr>
+            <w:tcW w:w="8882" w:type="dxa"/>
+            <w:tcBorders>
+              <w:top w:val="single" w:sz="8" w:space="0" w:color="000000"/>
+              <w:left w:val="single" w:sz="8" w:space="0" w:color="000000"/>
+              <w:bottom w:val="single" w:sz="8" w:space="0" w:color="000000"/>
+              <w:right w:val="single" w:sz="8" w:space="0" w:color="000000"/>
+            </w:tcBorders>
+            <w:hideMark/>
+          </w:tcPr>
+          <w:p>
+            <w:pPr>
+              <w:tabs>
+                <w:tab w:val="left" w:pos="888"/>
+                <w:tab w:val="center" w:pos="4338"/>
+              </w:tabs>
+              <w:spacing w:after="0" w:line="276" w:lineRule="auto"/>
+              <w:rPr>
+                <w:rFonts w:eastAsia="Times New Roman" w:cs="Times New Roman"/>
+                <w:b/>
+                <w:bCs/>
+                <w:szCs w:val="24"/>
+              </w:rPr>
+            </w:pPr>
+            <w:r>
+              <w:rPr>
+                <w:rFonts w:eastAsia="Times New Roman" w:cs="Times New Roman"/>
+                <w:b/>
+                <w:bCs/>
+                <w:color w:val="000000"/>
+                <w:szCs w:val="24"/>
+              </w:rPr>
+              <w:tab/>
+            </w:r>
+            <w:r>
+              <w:rPr>
+                <w:rFonts w:eastAsia="Times New Roman" w:cs="Times New Roman"/>
+                <w:b/>
+                <w:bCs/>
+                <w:color w:val="000000"/>
+                <w:szCs w:val="24"/>
+              </w:rPr>
+              <w:tab/>
+            </w:r>
+            <w:r>
+              <w:rPr>
+                <w:rFonts w:eastAsia="Times New Roman" w:cs="Times New Roman"/>
+                <w:b/>
+                <w:bCs/>
+                <w:color w:val="000000"/>
+                <w:szCs w:val="24"/>
+              </w:rPr>
+              <w:t>Авторизация через стороннего провайдера</w:t>
+            </w:r>
+          </w:p>
+        </w:tc>
+      </w:tr>
+      <w:tr>
+        <w:trPr>
+          <w:jc w:val="center"/>
+        </w:trPr>
+        <w:tc>
+          <w:tcPr>
+            <w:tcW w:w="8882" w:type="dxa"/>
+            <w:tcBorders>
+              <w:top w:val="single" w:sz="8" w:space="0" w:color="000000"/>
+              <w:left w:val="single" w:sz="8" w:space="0" w:color="000000"/>
+              <w:bottom w:val="single" w:sz="8" w:space="0" w:color="000000"/>
+              <w:right w:val="single" w:sz="8" w:space="0" w:color="000000"/>
+            </w:tcBorders>
+            <w:hideMark/>
+          </w:tcPr>
+          <w:p>
+            <w:pPr>
+              <w:spacing w:after="0" w:line="276" w:lineRule="auto"/>
+              <w:rPr>
+                <w:rFonts w:eastAsia="Times New Roman" w:cs="Times New Roman"/>
+                <w:szCs w:val="24"/>
+                <w:lang w:val="en-US"/>
+              </w:rPr>
+            </w:pPr>
+            <w:r>
+              <w:rPr>
+                <w:rFonts w:eastAsia="Times New Roman" w:cs="Times New Roman"/>
+                <w:b/>
+                <w:bCs/>
+                <w:color w:val="000000"/>
+                <w:szCs w:val="24"/>
+              </w:rPr>
+              <w:t>ID</w:t>
+            </w:r>
+            <w:r>
+              <w:rPr>
+                <w:rFonts w:eastAsia="Times New Roman" w:cs="Times New Roman"/>
+                <w:color w:val="000000"/>
+                <w:szCs w:val="24"/>
+              </w:rPr>
+              <w:t xml:space="preserve">: </w:t>
+            </w:r>
+            <w:r>
+              <w:rPr>
+                <w:rFonts w:eastAsia="Times New Roman" w:cs="Times New Roman"/>
+                <w:color w:val="000000"/>
+                <w:szCs w:val="24"/>
+                <w:lang w:val="en-US"/>
+              </w:rPr>
+              <w:t>UC-0</w:t>
+            </w:r>
+            <w:r>
+              <w:rPr>
+                <w:rFonts w:eastAsia="Times New Roman" w:cs="Times New Roman"/>
+                <w:color w:val="000000"/>
+                <w:szCs w:val="24"/>
+              </w:rPr>
+              <w:t>1</w:t>
+            </w:r>
+            <w:r>
+              <w:rPr>
+                <w:rFonts w:eastAsia="Times New Roman" w:cs="Times New Roman"/>
+                <w:color w:val="000000"/>
+                <w:szCs w:val="24"/>
+                <w:lang w:val="en-US"/>
+              </w:rPr>
+              <w:t>7</w:t>
+            </w:r>
+          </w:p>
+        </w:tc>
+      </w:tr>
+      <w:tr>
+        <w:trPr>
+          <w:jc w:val="center"/>
+        </w:trPr>
+        <w:tc>
+          <w:tcPr>
+            <w:tcW w:w="8882" w:type="dxa"/>
+            <w:tcBorders>
+              <w:top w:val="single" w:sz="8" w:space="0" w:color="000000"/>
+              <w:left w:val="single" w:sz="8" w:space="0" w:color="000000"/>
+              <w:bottom w:val="single" w:sz="8" w:space="0" w:color="000000"/>
+              <w:right w:val="single" w:sz="8" w:space="0" w:color="000000"/>
+            </w:tcBorders>
+            <w:hideMark/>
+          </w:tcPr>
+          <w:p>
+            <w:pPr>
+              <w:spacing w:after="0" w:line="276" w:lineRule="auto"/>
+              <w:rPr>
+                <w:rFonts w:eastAsia="Times New Roman" w:cs="Times New Roman"/>
+                <w:szCs w:val="24"/>
+              </w:rPr>
+            </w:pPr>
+            <w:r>
+              <w:rPr>
+                <w:rFonts w:eastAsia="Times New Roman" w:cs="Times New Roman"/>
+                <w:b/>
+                <w:bCs/>
+                <w:color w:val="000000"/>
+                <w:szCs w:val="24"/>
+              </w:rPr>
+              <w:t>Краткое описание:</w:t>
+            </w:r>
+            <w:r>
+              <w:rPr>
+                <w:rFonts w:eastAsia="Times New Roman" w:cs="Times New Roman"/>
+                <w:color w:val="000000"/>
+                <w:szCs w:val="24"/>
+              </w:rPr>
+              <w:t xml:space="preserve"> </w:t>
+            </w:r>
+            <w:r>
+              <w:rPr>
+                <w:rFonts w:eastAsia="Times New Roman" w:cs="Times New Roman"/>
+                <w:color w:val="000000"/>
+                <w:szCs w:val="24"/>
+              </w:rPr>
+              <w:t>Пользователь авторизуется, используя данные стороннего провайдера.</w:t>
+            </w:r>
+          </w:p>
+        </w:tc>
+      </w:tr>
+      <w:tr>
+        <w:trPr>
+          <w:jc w:val="center"/>
+        </w:trPr>
+        <w:tc>
+          <w:tcPr>
+            <w:tcW w:w="8882" w:type="dxa"/>
+            <w:tcBorders>
+              <w:top w:val="single" w:sz="8" w:space="0" w:color="000000"/>
+              <w:left w:val="single" w:sz="8" w:space="0" w:color="000000"/>
+              <w:bottom w:val="single" w:sz="8" w:space="0" w:color="000000"/>
+              <w:right w:val="single" w:sz="8" w:space="0" w:color="000000"/>
+            </w:tcBorders>
+            <w:hideMark/>
+          </w:tcPr>
+          <w:p>
+            <w:pPr>
+              <w:spacing w:after="0" w:line="276" w:lineRule="auto"/>
+              <w:rPr>
+                <w:rFonts w:eastAsia="Times New Roman" w:cs="Times New Roman"/>
+                <w:szCs w:val="24"/>
+              </w:rPr>
+            </w:pPr>
+            <w:r>
+              <w:rPr>
+                <w:rFonts w:eastAsia="Times New Roman" w:cs="Times New Roman"/>
+                <w:b/>
+                <w:bCs/>
+                <w:color w:val="000000"/>
+                <w:szCs w:val="24"/>
+              </w:rPr>
+              <w:lastRenderedPageBreak/>
+              <w:t>Главный актер:</w:t>
+            </w:r>
+            <w:r>
+              <w:rPr>
+                <w:rFonts w:eastAsia="Times New Roman" w:cs="Times New Roman"/>
+                <w:color w:val="000000"/>
+                <w:szCs w:val="24"/>
+              </w:rPr>
+              <w:t xml:space="preserve"> </w:t>
+            </w:r>
+            <w:r>
+              <w:rPr>
+                <w:rFonts w:eastAsia="Times New Roman" w:cs="Times New Roman"/>
+                <w:color w:val="000000"/>
+                <w:szCs w:val="24"/>
+              </w:rPr>
+              <w:t>Гость</w:t>
+            </w:r>
+          </w:p>
+        </w:tc>
+      </w:tr>
+      <w:tr>
+        <w:trPr>
+          <w:jc w:val="center"/>
+        </w:trPr>
+        <w:tc>
+          <w:tcPr>
+            <w:tcW w:w="8882" w:type="dxa"/>
+            <w:tcBorders>
+              <w:top w:val="single" w:sz="8" w:space="0" w:color="000000"/>
+              <w:left w:val="single" w:sz="8" w:space="0" w:color="000000"/>
+              <w:bottom w:val="single" w:sz="8" w:space="0" w:color="000000"/>
+              <w:right w:val="single" w:sz="8" w:space="0" w:color="000000"/>
+            </w:tcBorders>
+            <w:hideMark/>
+          </w:tcPr>
+          <w:p>
+            <w:pPr>
+              <w:spacing w:after="0" w:line="276" w:lineRule="auto"/>
+              <w:rPr>
+                <w:rFonts w:eastAsia="Times New Roman" w:cs="Times New Roman"/>
+                <w:szCs w:val="24"/>
+              </w:rPr>
+            </w:pPr>
+            <w:r>
+              <w:rPr>
+                <w:rFonts w:eastAsia="Times New Roman" w:cs="Times New Roman"/>
+                <w:b/>
+                <w:bCs/>
+                <w:color w:val="000000"/>
+                <w:szCs w:val="24"/>
+              </w:rPr>
+              <w:t>Предусловия:</w:t>
+            </w:r>
+            <w:r>
+              <w:rPr>
+                <w:rFonts w:eastAsia="Times New Roman" w:cs="Times New Roman"/>
+                <w:color w:val="000000"/>
+                <w:szCs w:val="24"/>
+              </w:rPr>
+              <w:t xml:space="preserve"> </w:t>
+            </w:r>
+            <w:r>
+              <w:rPr>
+                <w:rFonts w:eastAsia="Times New Roman" w:cs="Times New Roman"/>
+                <w:color w:val="000000"/>
+                <w:szCs w:val="24"/>
+              </w:rPr>
+              <w:t xml:space="preserve">Пользователь </w:t>
+            </w:r>
+            <w:r>
+              <w:rPr>
+                <w:rFonts w:eastAsia="Times New Roman" w:cs="Times New Roman"/>
+                <w:color w:val="000000"/>
+                <w:szCs w:val="24"/>
+              </w:rPr>
+              <w:t>имеет аккаунт на платформе, имеет привязку к стороннему провайдеру авторизации.</w:t>
+            </w:r>
+          </w:p>
+        </w:tc>
+      </w:tr>
+      <w:tr>
+        <w:trPr>
+          <w:trHeight w:val="435"/>
+          <w:jc w:val="center"/>
+        </w:trPr>
+        <w:tc>
+          <w:tcPr>
+            <w:tcW w:w="8882" w:type="dxa"/>
+            <w:tcBorders>
+              <w:top w:val="single" w:sz="8" w:space="0" w:color="000000"/>
+              <w:left w:val="single" w:sz="8" w:space="0" w:color="000000"/>
+              <w:bottom w:val="single" w:sz="8" w:space="0" w:color="000000"/>
+              <w:right w:val="single" w:sz="8" w:space="0" w:color="000000"/>
+            </w:tcBorders>
+            <w:hideMark/>
+          </w:tcPr>
+          <w:p>
+            <w:pPr>
+              <w:spacing w:after="0" w:line="276" w:lineRule="auto"/>
+              <w:rPr>
+                <w:rFonts w:eastAsia="Times New Roman" w:cs="Times New Roman"/>
+                <w:b/>
+                <w:bCs/>
+                <w:color w:val="000000"/>
+                <w:szCs w:val="24"/>
+              </w:rPr>
+            </w:pPr>
+            <w:r>
+              <w:rPr>
+                <w:rFonts w:eastAsia="Times New Roman" w:cs="Times New Roman"/>
+                <w:b/>
+                <w:bCs/>
+                <w:color w:val="000000"/>
+                <w:szCs w:val="24"/>
+              </w:rPr>
+              <w:t>Основной поток: </w:t>
+            </w:r>
+          </w:p>
+          <w:p>
+            <w:pPr>
+              <w:pStyle w:val="ListParagraph"/>
+              <w:numPr>
+                <w:ilvl w:val="0"/>
+                <w:numId w:val="36"/>
+              </w:numPr>
+              <w:spacing w:after="0" w:line="276" w:lineRule="auto"/>
+              <w:rPr>
+                <w:rFonts w:cs="Times New Roman"/>
+                <w:szCs w:val="24"/>
+              </w:rPr>
+            </w:pPr>
+            <w:r>
+              <w:rPr>
+                <w:rFonts w:cs="Times New Roman"/>
+                <w:szCs w:val="24"/>
+              </w:rPr>
+              <w:t>Гость отправляет запрос авторизации к стороннему провайдеру.</w:t>
+            </w:r>
+          </w:p>
+          <w:p>
+            <w:pPr>
+              <w:pStyle w:val="ListParagraph"/>
+              <w:numPr>
+                <w:ilvl w:val="0"/>
+                <w:numId w:val="36"/>
+              </w:numPr>
+              <w:spacing w:after="0" w:line="276" w:lineRule="auto"/>
+              <w:rPr>
+                <w:rFonts w:cs="Times New Roman"/>
+                <w:szCs w:val="24"/>
+              </w:rPr>
+            </w:pPr>
+            <w:r>
+              <w:rPr>
+                <w:rFonts w:cs="Times New Roman"/>
+                <w:szCs w:val="24"/>
+              </w:rPr>
+              <w:t>Система авторизует пользователя.</w:t>
+            </w:r>
+          </w:p>
+        </w:tc>
+      </w:tr>
+      <w:tr>
+        <w:trPr>
+          <w:trHeight w:val="435"/>
+          <w:jc w:val="center"/>
+        </w:trPr>
+        <w:tc>
+          <w:tcPr>
+            <w:tcW w:w="8882" w:type="dxa"/>
+            <w:tcBorders>
+              <w:top w:val="single" w:sz="8" w:space="0" w:color="000000"/>
+              <w:left w:val="single" w:sz="8" w:space="0" w:color="000000"/>
+              <w:bottom w:val="single" w:sz="8" w:space="0" w:color="000000"/>
+              <w:right w:val="single" w:sz="8" w:space="0" w:color="000000"/>
+            </w:tcBorders>
+          </w:tcPr>
+          <w:p>
+            <w:pPr>
+              <w:spacing w:after="0"/>
+              <w:rPr>
+                <w:rFonts w:cs="Times New Roman"/>
+                <w:b/>
+                <w:bCs/>
+                <w:szCs w:val="24"/>
+              </w:rPr>
+            </w:pPr>
+            <w:r>
+              <w:rPr>
+                <w:rFonts w:eastAsia="Times New Roman" w:cs="Times New Roman"/>
+                <w:b/>
+                <w:bCs/>
+                <w:color w:val="000000"/>
+                <w:szCs w:val="24"/>
+              </w:rPr>
+              <w:t xml:space="preserve">Альтернативный поток: </w:t>
+            </w:r>
+          </w:p>
+          <w:p>
+            <w:pPr>
+              <w:pStyle w:val="ListParagraph"/>
+              <w:numPr>
+                <w:ilvl w:val="0"/>
+                <w:numId w:val="12"/>
+              </w:numPr>
+              <w:spacing w:after="0" w:line="276" w:lineRule="auto"/>
+              <w:rPr>
+                <w:rFonts w:eastAsia="Times New Roman" w:cs="Times New Roman"/>
+                <w:color w:val="000000"/>
+                <w:szCs w:val="24"/>
+              </w:rPr>
+            </w:pPr>
+            <w:r>
+              <w:rPr>
+                <w:rFonts w:eastAsia="Times New Roman" w:cs="Times New Roman"/>
+                <w:color w:val="000000"/>
+                <w:szCs w:val="24"/>
+              </w:rPr>
+              <w:t xml:space="preserve">Если </w:t>
+            </w:r>
+            <w:r>
+              <w:rPr>
+                <w:rFonts w:eastAsia="Times New Roman" w:cs="Times New Roman"/>
+                <w:color w:val="000000"/>
+                <w:szCs w:val="24"/>
+              </w:rPr>
+              <w:t>провайдер не авторизовал пользователя, сессия не создаётся.</w:t>
+            </w:r>
+          </w:p>
+        </w:tc>
+      </w:tr>
+      <w:tr>
+        <w:trPr>
+          <w:trHeight w:val="435"/>
+          <w:jc w:val="center"/>
+        </w:trPr>
+        <w:tc>
+          <w:tcPr>
+            <w:tcW w:w="8882" w:type="dxa"/>
+            <w:tcBorders>
+              <w:top w:val="single" w:sz="8" w:space="0" w:color="000000"/>
+              <w:left w:val="single" w:sz="8" w:space="0" w:color="000000"/>
+              <w:bottom w:val="single" w:sz="8" w:space="0" w:color="000000"/>
+              <w:right w:val="single" w:sz="8" w:space="0" w:color="000000"/>
+            </w:tcBorders>
+          </w:tcPr>
+          <w:p>
+            <w:pPr>
+              <w:spacing w:after="0"/>
+              <w:rPr>
+                <w:rFonts w:eastAsia="Times New Roman" w:cs="Times New Roman"/>
+                <w:b/>
+                <w:bCs/>
+                <w:color w:val="000000"/>
+                <w:szCs w:val="24"/>
+              </w:rPr>
+            </w:pPr>
+            <w:r>
+              <w:rPr>
+                <w:rFonts w:eastAsia="Times New Roman" w:cs="Times New Roman"/>
+                <w:b/>
+                <w:bCs/>
+                <w:color w:val="000000"/>
+                <w:szCs w:val="24"/>
+              </w:rPr>
+              <w:t>Постусловия</w:t>
+            </w:r>
+            <w:r>
+              <w:rPr>
+                <w:rFonts w:eastAsia="Times New Roman" w:cs="Times New Roman"/>
+                <w:b/>
+                <w:bCs/>
+                <w:color w:val="000000"/>
+                <w:szCs w:val="24"/>
+              </w:rPr>
+              <w:t>:</w:t>
+            </w:r>
+          </w:p>
+          <w:p>
+            <w:pPr>
+              <w:spacing w:after="0"/>
+              <w:rPr>
+                <w:rFonts w:eastAsia="Times New Roman" w:cs="Times New Roman"/>
+                <w:color w:val="000000"/>
+                <w:szCs w:val="24"/>
+              </w:rPr>
+            </w:pPr>
+            <w:r>
+              <w:rPr>
+                <w:rFonts w:eastAsia="Times New Roman" w:cs="Times New Roman"/>
+                <w:color w:val="000000"/>
+                <w:szCs w:val="24"/>
+              </w:rPr>
+              <w:t xml:space="preserve">Пользователь </w:t>
+            </w:r>
+            <w:r>
+              <w:rPr>
+                <w:rFonts w:eastAsia="Times New Roman" w:cs="Times New Roman"/>
+                <w:color w:val="000000"/>
+                <w:szCs w:val="24"/>
+              </w:rPr>
+              <w:t>авторизован в системе.</w:t>
+            </w:r>
+          </w:p>
+        </w:tc>
+      </w:tr>
+    </w:tbl>
+    <w:p>
+      <w:pPr>
+        <w:spacing w:after="0"/>
+        <w:rPr>
+          <w:rFonts w:cs="Times New Roman"/>
+          <w:szCs w:val="24"/>
+        </w:rPr>
+      </w:pPr>
+    </w:p>
+    <w:p>
+      <w:pPr>
+        <w:spacing w:after="0"/>
+        <w:rPr>
+          <w:rFonts w:cs="Times New Roman"/>
+          <w:szCs w:val="24"/>
+        </w:rPr>
+      </w:pPr>
+    </w:p>
+    <w:p>
+      <w:pPr>
+        <w:spacing w:after="0"/>
+        <w:rPr>
+          <w:rFonts w:cs="Times New Roman"/>
+          <w:szCs w:val="24"/>
+        </w:rPr>
+      </w:pPr>
+    </w:p>
+    <w:p>
+      <w:pPr>
+        <w:rPr>
+          <w:rFonts w:cs="Times New Roman"/>
+          <w:szCs w:val="24"/>
+        </w:rPr>
+      </w:pPr>
+    </w:p>
+    <w:tbl>
+      <w:tblPr>
+        <w:tblW w:w="8882" w:type="dxa"/>
+        <w:jc w:val="center"/>
+        <w:tblCellMar>
+          <w:left w:w="98" w:type="dxa"/>
+        </w:tblCellMar>
+        <w:tblLook w:val="04A0" w:firstRow="1" w:lastRow="0" w:firstColumn="1" w:lastColumn="0" w:noHBand="0" w:noVBand="1"/>
+      </w:tblPr>
+      <w:tblGrid>
+        <w:gridCol w:w="8882"/>
+      </w:tblGrid>
+      <w:tr>
+        <w:trPr>
+          <w:trHeight w:val="465"/>
+          <w:jc w:val="center"/>
+        </w:trPr>
+        <w:tc>
+          <w:tcPr>
+            <w:tcW w:w="8882" w:type="dxa"/>
+            <w:tcBorders>
+              <w:top w:val="single" w:sz="8" w:space="0" w:color="000000"/>
+              <w:left w:val="single" w:sz="8" w:space="0" w:color="000000"/>
+              <w:bottom w:val="single" w:sz="8" w:space="0" w:color="000000"/>
+              <w:right w:val="single" w:sz="8" w:space="0" w:color="000000"/>
+            </w:tcBorders>
+            <w:hideMark/>
+          </w:tcPr>
+          <w:p>
+            <w:pPr>
+              <w:tabs>
+                <w:tab w:val="left" w:pos="888"/>
+                <w:tab w:val="center" w:pos="4338"/>
+              </w:tabs>
+              <w:spacing w:after="0" w:line="276" w:lineRule="auto"/>
+              <w:rPr>
+                <w:rFonts w:eastAsia="Times New Roman" w:cs="Times New Roman"/>
+                <w:b/>
+                <w:bCs/>
+                <w:szCs w:val="24"/>
+              </w:rPr>
+            </w:pPr>
+            <w:r>
+              <w:rPr>
+                <w:rFonts w:eastAsia="Times New Roman" w:cs="Times New Roman"/>
+                <w:b/>
+                <w:bCs/>
+                <w:color w:val="000000"/>
+                <w:szCs w:val="24"/>
+              </w:rPr>
+              <w:tab/>
+            </w:r>
+            <w:r>
+              <w:rPr>
+                <w:rFonts w:eastAsia="Times New Roman" w:cs="Times New Roman"/>
+                <w:b/>
+                <w:bCs/>
+                <w:color w:val="000000"/>
+                <w:szCs w:val="24"/>
+              </w:rPr>
+              <w:tab/>
+            </w:r>
+            <w:r>
+              <w:rPr>
+                <w:rFonts w:eastAsia="Times New Roman" w:cs="Times New Roman"/>
+                <w:b/>
+                <w:bCs/>
+                <w:color w:val="000000"/>
+                <w:szCs w:val="24"/>
+              </w:rPr>
+              <w:t>Настройка приватности</w:t>
+            </w:r>
+          </w:p>
+        </w:tc>
+      </w:tr>
+      <w:tr>
+        <w:trPr>
+          <w:jc w:val="center"/>
+        </w:trPr>
+        <w:tc>
+          <w:tcPr>
+            <w:tcW w:w="8882" w:type="dxa"/>
+            <w:tcBorders>
+              <w:top w:val="single" w:sz="8" w:space="0" w:color="000000"/>
+              <w:left w:val="single" w:sz="8" w:space="0" w:color="000000"/>
+              <w:bottom w:val="single" w:sz="8" w:space="0" w:color="000000"/>
+              <w:right w:val="single" w:sz="8" w:space="0" w:color="000000"/>
+            </w:tcBorders>
+            <w:hideMark/>
+          </w:tcPr>
+          <w:p>
+            <w:pPr>
+              <w:spacing w:after="0" w:line="276" w:lineRule="auto"/>
+              <w:rPr>
+                <w:rFonts w:eastAsia="Times New Roman" w:cs="Times New Roman"/>
+                <w:szCs w:val="24"/>
+                <w:lang w:val="en-US"/>
+              </w:rPr>
+            </w:pPr>
+            <w:r>
+              <w:rPr>
+                <w:rFonts w:eastAsia="Times New Roman" w:cs="Times New Roman"/>
+                <w:b/>
+                <w:bCs/>
+                <w:color w:val="000000"/>
+                <w:szCs w:val="24"/>
+              </w:rPr>
+              <w:t>ID</w:t>
+            </w:r>
+            <w:r>
+              <w:rPr>
+                <w:rFonts w:eastAsia="Times New Roman" w:cs="Times New Roman"/>
+                <w:color w:val="000000"/>
+                <w:szCs w:val="24"/>
+              </w:rPr>
+              <w:t xml:space="preserve">: </w:t>
+            </w:r>
+            <w:r>
+              <w:rPr>
+                <w:rFonts w:eastAsia="Times New Roman" w:cs="Times New Roman"/>
+                <w:color w:val="000000"/>
+                <w:szCs w:val="24"/>
+                <w:lang w:val="en-US"/>
+              </w:rPr>
+              <w:t>UC-0</w:t>
+            </w:r>
+            <w:r>
+              <w:rPr>
+                <w:rFonts w:eastAsia="Times New Roman" w:cs="Times New Roman"/>
+                <w:color w:val="000000"/>
+                <w:szCs w:val="24"/>
+              </w:rPr>
+              <w:t>1</w:t>
+            </w:r>
+            <w:r>
+              <w:rPr>
+                <w:rFonts w:eastAsia="Times New Roman" w:cs="Times New Roman"/>
+                <w:color w:val="000000"/>
+                <w:szCs w:val="24"/>
+              </w:rPr>
+              <w:t>8</w:t>
+            </w:r>
+          </w:p>
+        </w:tc>
+      </w:tr>
+      <w:tr>
+        <w:trPr>
+          <w:jc w:val="center"/>
+        </w:trPr>
+        <w:tc>
+          <w:tcPr>
+            <w:tcW w:w="8882" w:type="dxa"/>
+            <w:tcBorders>
+              <w:top w:val="single" w:sz="8" w:space="0" w:color="000000"/>
+              <w:left w:val="single" w:sz="8" w:space="0" w:color="000000"/>
+              <w:bottom w:val="single" w:sz="8" w:space="0" w:color="000000"/>
+              <w:right w:val="single" w:sz="8" w:space="0" w:color="000000"/>
+            </w:tcBorders>
+            <w:hideMark/>
+          </w:tcPr>
+          <w:p>
+            <w:pPr>
+              <w:spacing w:after="0" w:line="276" w:lineRule="auto"/>
+              <w:rPr>
+                <w:rFonts w:eastAsia="Times New Roman" w:cs="Times New Roman"/>
+                <w:color w:val="000000"/>
+                <w:szCs w:val="24"/>
+              </w:rPr>
+            </w:pPr>
+            <w:r>
+              <w:rPr>
+                <w:rFonts w:eastAsia="Times New Roman" w:cs="Times New Roman"/>
+                <w:b/>
+                <w:bCs/>
+                <w:color w:val="000000"/>
+                <w:szCs w:val="24"/>
+              </w:rPr>
+              <w:t>Краткое описание:</w:t>
+            </w:r>
+            <w:r>
+              <w:rPr>
+                <w:rFonts w:eastAsia="Times New Roman" w:cs="Times New Roman"/>
+                <w:color w:val="000000"/>
+                <w:szCs w:val="24"/>
+              </w:rPr>
+              <w:t xml:space="preserve"> </w:t>
+            </w:r>
+            <w:r>
+              <w:rPr>
+                <w:rFonts w:eastAsia="Times New Roman" w:cs="Times New Roman"/>
+                <w:color w:val="000000"/>
+                <w:szCs w:val="24"/>
+              </w:rPr>
+              <w:t xml:space="preserve">Пользователь </w:t>
+            </w:r>
+            <w:r>
+              <w:rPr>
+                <w:rFonts w:eastAsia="Times New Roman" w:cs="Times New Roman"/>
+                <w:color w:val="000000"/>
+                <w:szCs w:val="24"/>
+              </w:rPr>
+              <w:t>ограничивает видимость личных данных</w:t>
+            </w:r>
+          </w:p>
+        </w:tc>
+      </w:tr>
+      <w:tr>
+        <w:trPr>
+          <w:jc w:val="center"/>
+        </w:trPr>
+        <w:tc>
+          <w:tcPr>
+            <w:tcW w:w="8882" w:type="dxa"/>
+            <w:tcBorders>
+              <w:top w:val="single" w:sz="8" w:space="0" w:color="000000"/>
+              <w:left w:val="single" w:sz="8" w:space="0" w:color="000000"/>
+              <w:bottom w:val="single" w:sz="8" w:space="0" w:color="000000"/>
+              <w:right w:val="single" w:sz="8" w:space="0" w:color="000000"/>
+            </w:tcBorders>
+            <w:hideMark/>
+          </w:tcPr>
+          <w:p>
+            <w:pPr>
+              <w:spacing w:after="0" w:line="276" w:lineRule="auto"/>
+              <w:rPr>
+                <w:rFonts w:eastAsia="Times New Roman" w:cs="Times New Roman"/>
+                <w:szCs w:val="24"/>
+              </w:rPr>
+            </w:pPr>
+            <w:r>
+              <w:rPr>
+                <w:rFonts w:eastAsia="Times New Roman" w:cs="Times New Roman"/>
+                <w:b/>
+                <w:bCs/>
+                <w:color w:val="000000"/>
+                <w:szCs w:val="24"/>
+              </w:rPr>
+              <w:t>Главный актер:</w:t>
+            </w:r>
+            <w:r>
+              <w:rPr>
+                <w:rFonts w:eastAsia="Times New Roman" w:cs="Times New Roman"/>
+                <w:color w:val="000000"/>
+                <w:szCs w:val="24"/>
+              </w:rPr>
+              <w:t xml:space="preserve"> </w:t>
+            </w:r>
+            <w:r>
+              <w:rPr>
+                <w:rFonts w:eastAsia="Times New Roman" w:cs="Times New Roman"/>
+                <w:color w:val="000000"/>
+                <w:szCs w:val="24"/>
+              </w:rPr>
+              <w:t>Пользователь</w:t>
+            </w:r>
+          </w:p>
+        </w:tc>
+      </w:tr>
+      <w:tr>
+        <w:trPr>
+          <w:jc w:val="center"/>
+        </w:trPr>
+        <w:tc>
+          <w:tcPr>
+            <w:tcW w:w="8882" w:type="dxa"/>
+            <w:tcBorders>
+              <w:top w:val="single" w:sz="8" w:space="0" w:color="000000"/>
+              <w:left w:val="single" w:sz="8" w:space="0" w:color="000000"/>
+              <w:bottom w:val="single" w:sz="8" w:space="0" w:color="000000"/>
+              <w:right w:val="single" w:sz="8" w:space="0" w:color="000000"/>
+            </w:tcBorders>
+            <w:hideMark/>
+          </w:tcPr>
+          <w:p>
+            <w:pPr>
+              <w:spacing w:after="0" w:line="276" w:lineRule="auto"/>
+              <w:rPr>
+                <w:rFonts w:eastAsia="Times New Roman" w:cs="Times New Roman"/>
+                <w:szCs w:val="24"/>
+              </w:rPr>
+            </w:pPr>
+            <w:r>
+              <w:rPr>
+                <w:rFonts w:eastAsia="Times New Roman" w:cs="Times New Roman"/>
+                <w:b/>
+                <w:bCs/>
+                <w:color w:val="000000"/>
+                <w:szCs w:val="24"/>
+              </w:rPr>
+              <w:t>Предусловия:</w:t>
+            </w:r>
+            <w:r>
+              <w:rPr>
+                <w:rFonts w:eastAsia="Times New Roman" w:cs="Times New Roman"/>
+                <w:color w:val="000000"/>
+                <w:szCs w:val="24"/>
+              </w:rPr>
+              <w:t xml:space="preserve"> </w:t>
+            </w:r>
+            <w:r>
+              <w:rPr>
+                <w:rFonts w:eastAsia="Times New Roman" w:cs="Times New Roman"/>
+                <w:color w:val="000000"/>
+                <w:szCs w:val="24"/>
+              </w:rPr>
+              <w:t>Пользователь не имеет ограничений видимости личных данных</w:t>
+            </w:r>
+          </w:p>
+        </w:tc>
+      </w:tr>
+      <w:tr>
+        <w:trPr>
+          <w:trHeight w:val="435"/>
+          <w:jc w:val="center"/>
+        </w:trPr>
+        <w:tc>
+          <w:tcPr>
+            <w:tcW w:w="8882" w:type="dxa"/>
+            <w:tcBorders>
+              <w:top w:val="single" w:sz="8" w:space="0" w:color="000000"/>
+              <w:left w:val="single" w:sz="8" w:space="0" w:color="000000"/>
+              <w:bottom w:val="single" w:sz="8" w:space="0" w:color="000000"/>
+              <w:right w:val="single" w:sz="8" w:space="0" w:color="000000"/>
+            </w:tcBorders>
+            <w:hideMark/>
+          </w:tcPr>
+          <w:p>
+            <w:pPr>
+              <w:spacing w:after="0" w:line="276" w:lineRule="auto"/>
+              <w:rPr>
+                <w:rFonts w:eastAsia="Times New Roman" w:cs="Times New Roman"/>
+                <w:b/>
+                <w:bCs/>
+                <w:color w:val="000000"/>
+                <w:szCs w:val="24"/>
+              </w:rPr>
+            </w:pPr>
+            <w:r>
+              <w:rPr>
+                <w:rFonts w:eastAsia="Times New Roman" w:cs="Times New Roman"/>
+                <w:b/>
+                <w:bCs/>
+                <w:color w:val="000000"/>
+                <w:szCs w:val="24"/>
+              </w:rPr>
+              <w:t>Основной поток: </w:t>
+            </w:r>
+          </w:p>
+          <w:p>
+            <w:pPr>
+              <w:pStyle w:val="ListParagraph"/>
+              <w:numPr>
+                <w:ilvl w:val="0"/>
+                <w:numId w:val="38"/>
+              </w:numPr>
+              <w:spacing w:after="0" w:line="276" w:lineRule="auto"/>
+              <w:rPr>
+                <w:rFonts w:cs="Times New Roman"/>
+                <w:szCs w:val="24"/>
+              </w:rPr>
+            </w:pPr>
+            <w:r>
+              <w:rPr>
+                <w:rFonts w:cs="Times New Roman"/>
+                <w:szCs w:val="24"/>
+              </w:rPr>
+              <w:t>Пол</w:t>
+            </w:r>
+            <w:r>
+              <w:rPr>
+                <w:rFonts w:cs="Times New Roman"/>
+                <w:szCs w:val="24"/>
+              </w:rPr>
+              <w:t>ьзователь отправляет запрос на ограничение видимости личных данных</w:t>
+            </w:r>
+          </w:p>
+          <w:p>
+            <w:pPr>
+              <w:pStyle w:val="ListParagraph"/>
+              <w:numPr>
+                <w:ilvl w:val="0"/>
+                <w:numId w:val="38"/>
+              </w:numPr>
+              <w:spacing w:after="0" w:line="276" w:lineRule="auto"/>
+              <w:rPr>
+                <w:rFonts w:cs="Times New Roman"/>
+                <w:szCs w:val="24"/>
+              </w:rPr>
+            </w:pPr>
+            <w:r>
+              <w:rPr>
+                <w:rFonts w:cs="Times New Roman"/>
+                <w:szCs w:val="24"/>
+              </w:rPr>
+              <w:t>Система ограничивает доступ к личным данным пользователя</w:t>
+            </w:r>
+          </w:p>
+        </w:tc>
+      </w:tr>
+      <w:tr>
+        <w:trPr>
+          <w:trHeight w:val="435"/>
+          <w:jc w:val="center"/>
+        </w:trPr>
+        <w:tc>
+          <w:tcPr>
+            <w:tcW w:w="8882" w:type="dxa"/>
+            <w:tcBorders>
+              <w:top w:val="single" w:sz="8" w:space="0" w:color="000000"/>
+              <w:left w:val="single" w:sz="8" w:space="0" w:color="000000"/>
+              <w:bottom w:val="single" w:sz="8" w:space="0" w:color="000000"/>
+              <w:right w:val="single" w:sz="8" w:space="0" w:color="000000"/>
+            </w:tcBorders>
+          </w:tcPr>
+          <w:p>
+            <w:pPr>
+              <w:spacing w:after="0"/>
+              <w:rPr>
+                <w:rFonts w:cs="Times New Roman"/>
+                <w:b/>
+                <w:bCs/>
+                <w:szCs w:val="24"/>
+              </w:rPr>
+            </w:pPr>
+            <w:r>
+              <w:rPr>
+                <w:rFonts w:eastAsia="Times New Roman" w:cs="Times New Roman"/>
+                <w:b/>
+                <w:bCs/>
+                <w:color w:val="000000"/>
+                <w:szCs w:val="24"/>
+              </w:rPr>
+              <w:t xml:space="preserve">Альтернативный поток: </w:t>
+            </w:r>
+          </w:p>
+        </w:tc>
+      </w:tr>
+      <w:tr>
+        <w:trPr>
+          <w:trHeight w:val="435"/>
+          <w:jc w:val="center"/>
+        </w:trPr>
+        <w:tc>
+          <w:tcPr>
+            <w:tcW w:w="8882" w:type="dxa"/>
+            <w:tcBorders>
+              <w:top w:val="single" w:sz="8" w:space="0" w:color="000000"/>
+              <w:left w:val="single" w:sz="8" w:space="0" w:color="000000"/>
+              <w:bottom w:val="single" w:sz="8" w:space="0" w:color="000000"/>
+              <w:right w:val="single" w:sz="8" w:space="0" w:color="000000"/>
+            </w:tcBorders>
+          </w:tcPr>
+          <w:p>
+            <w:pPr>
+              <w:spacing w:after="0"/>
+              <w:rPr>
+                <w:rFonts w:eastAsia="Times New Roman" w:cs="Times New Roman"/>
+                <w:b/>
+                <w:bCs/>
+                <w:color w:val="000000"/>
+                <w:szCs w:val="24"/>
+              </w:rPr>
+            </w:pPr>
+            <w:r>
+              <w:rPr>
+                <w:rFonts w:eastAsia="Times New Roman" w:cs="Times New Roman"/>
+                <w:b/>
+                <w:bCs/>
+                <w:color w:val="000000"/>
+                <w:szCs w:val="24"/>
+              </w:rPr>
+              <w:t>Постусловия</w:t>
+            </w:r>
+            <w:r>
+              <w:rPr>
+                <w:rFonts w:eastAsia="Times New Roman" w:cs="Times New Roman"/>
+                <w:b/>
+                <w:bCs/>
+                <w:color w:val="000000"/>
+                <w:szCs w:val="24"/>
+              </w:rPr>
+              <w:t>:</w:t>
+            </w:r>
+          </w:p>
+          <w:p>
+            <w:pPr>
+              <w:spacing w:after="0"/>
+              <w:rPr>
+                <w:rFonts w:eastAsia="Times New Roman" w:cs="Times New Roman"/>
+                <w:color w:val="000000"/>
+                <w:szCs w:val="24"/>
+              </w:rPr>
+            </w:pPr>
+            <w:r>
+              <w:rPr>
+                <w:rFonts w:eastAsia="Times New Roman" w:cs="Times New Roman"/>
+                <w:color w:val="000000"/>
+                <w:szCs w:val="24"/>
+              </w:rPr>
+              <w:t>Видимость личных данных пользователя ограничена.</w:t>
+            </w:r>
+          </w:p>
+        </w:tc>
+      </w:tr>
+    </w:tbl>
+    <w:p>
+      <w:pPr>
+        <w:spacing w:after="0"/>
+        <w:rPr>
+          <w:rFonts w:cs="Times New Roman"/>
+          <w:szCs w:val="24"/>
+        </w:rPr>
+      </w:pPr>
+    </w:p>
+    <w:p>
+      <w:pPr>
+        <w:rPr>
+          <w:rFonts w:cs="Times New Roman"/>
+          <w:szCs w:val="24"/>
+        </w:rPr>
+      </w:pPr>
+    </w:p>
+    <w:tbl>
+      <w:tblPr>
+        <w:tblW w:w="8882" w:type="dxa"/>
+        <w:jc w:val="center"/>
+        <w:tblCellMar>
+          <w:left w:w="98" w:type="dxa"/>
+        </w:tblCellMar>
+        <w:tblLook w:val="04A0" w:firstRow="1" w:lastRow="0" w:firstColumn="1" w:lastColumn="0" w:noHBand="0" w:noVBand="1"/>
+      </w:tblPr>
+      <w:tblGrid>
+        <w:gridCol w:w="8882"/>
+      </w:tblGrid>
+      <w:tr>
+        <w:trPr>
+          <w:trHeight w:val="465"/>
+          <w:jc w:val="center"/>
+        </w:trPr>
+        <w:tc>
+          <w:tcPr>
+            <w:tcW w:w="8882" w:type="dxa"/>
+            <w:tcBorders>
+              <w:top w:val="single" w:sz="8" w:space="0" w:color="000000"/>
+              <w:left w:val="single" w:sz="8" w:space="0" w:color="000000"/>
+              <w:bottom w:val="single" w:sz="8" w:space="0" w:color="000000"/>
+              <w:right w:val="single" w:sz="8" w:space="0" w:color="000000"/>
+            </w:tcBorders>
+            <w:hideMark/>
+          </w:tcPr>
+          <w:p>
+            <w:pPr>
+              <w:tabs>
+                <w:tab w:val="left" w:pos="888"/>
+                <w:tab w:val="center" w:pos="4338"/>
+              </w:tabs>
+              <w:spacing w:after="0" w:line="276" w:lineRule="auto"/>
+              <w:rPr>
+                <w:rFonts w:eastAsia="Times New Roman" w:cs="Times New Roman"/>
+                <w:b/>
+                <w:bCs/>
+                <w:szCs w:val="24"/>
+              </w:rPr>
+            </w:pPr>
+            <w:r>
+              <w:rPr>
+                <w:rFonts w:eastAsia="Times New Roman" w:cs="Times New Roman"/>
+                <w:b/>
+                <w:bCs/>
+                <w:color w:val="000000"/>
+                <w:szCs w:val="24"/>
+              </w:rPr>
+              <w:tab/>
+            </w:r>
+            <w:r>
+              <w:rPr>
+                <w:rFonts w:eastAsia="Times New Roman" w:cs="Times New Roman"/>
+                <w:b/>
+                <w:bCs/>
+                <w:color w:val="000000"/>
+                <w:szCs w:val="24"/>
+              </w:rPr>
+              <w:tab/>
+            </w:r>
+            <w:r>
+              <w:rPr>
+                <w:rFonts w:eastAsia="Times New Roman" w:cs="Times New Roman"/>
+                <w:b/>
+                <w:bCs/>
+                <w:color w:val="000000"/>
+                <w:szCs w:val="24"/>
+              </w:rPr>
+              <w:t>Создание рекламной кампании</w:t>
+            </w:r>
+          </w:p>
+        </w:tc>
+      </w:tr>
+      <w:tr>
+        <w:trPr>
+          <w:jc w:val="center"/>
+        </w:trPr>
+        <w:tc>
+          <w:tcPr>
+            <w:tcW w:w="8882" w:type="dxa"/>
+            <w:tcBorders>
+              <w:top w:val="single" w:sz="8" w:space="0" w:color="000000"/>
+              <w:left w:val="single" w:sz="8" w:space="0" w:color="000000"/>
+              <w:bottom w:val="single" w:sz="8" w:space="0" w:color="000000"/>
+              <w:right w:val="single" w:sz="8" w:space="0" w:color="000000"/>
+            </w:tcBorders>
+            <w:hideMark/>
+          </w:tcPr>
+          <w:p>
+            <w:pPr>
+              <w:spacing w:after="0" w:line="276" w:lineRule="auto"/>
+              <w:rPr>
+                <w:rFonts w:eastAsia="Times New Roman" w:cs="Times New Roman"/>
+                <w:szCs w:val="24"/>
+                <w:lang w:val="en-US"/>
+              </w:rPr>
+            </w:pPr>
+            <w:r>
+              <w:rPr>
+                <w:rFonts w:eastAsia="Times New Roman" w:cs="Times New Roman"/>
+                <w:b/>
+                <w:bCs/>
+                <w:color w:val="000000"/>
+                <w:szCs w:val="24"/>
+              </w:rPr>
+              <w:t>ID</w:t>
+            </w:r>
+            <w:r>
+              <w:rPr>
+                <w:rFonts w:eastAsia="Times New Roman" w:cs="Times New Roman"/>
+                <w:color w:val="000000"/>
+                <w:szCs w:val="24"/>
+              </w:rPr>
+              <w:t xml:space="preserve">: </w:t>
+            </w:r>
+            <w:r>
+              <w:rPr>
+                <w:rFonts w:eastAsia="Times New Roman" w:cs="Times New Roman"/>
+                <w:color w:val="000000"/>
+                <w:szCs w:val="24"/>
+                <w:lang w:val="en-US"/>
+              </w:rPr>
+              <w:t>UC-0</w:t>
+            </w:r>
+            <w:r>
+              <w:rPr>
+                <w:rFonts w:eastAsia="Times New Roman" w:cs="Times New Roman"/>
+                <w:color w:val="000000"/>
+                <w:szCs w:val="24"/>
+              </w:rPr>
+              <w:t>1</w:t>
+            </w:r>
+            <w:r>
+              <w:rPr>
+                <w:rFonts w:eastAsia="Times New Roman" w:cs="Times New Roman"/>
+                <w:color w:val="000000"/>
+                <w:szCs w:val="24"/>
+              </w:rPr>
+              <w:t>9</w:t>
+            </w:r>
+          </w:p>
+        </w:tc>
+      </w:tr>
+      <w:tr>
+        <w:trPr>
+          <w:jc w:val="center"/>
+        </w:trPr>
+        <w:tc>
+          <w:tcPr>
+            <w:tcW w:w="8882" w:type="dxa"/>
+            <w:tcBorders>
+              <w:top w:val="single" w:sz="8" w:space="0" w:color="000000"/>
+              <w:left w:val="single" w:sz="8" w:space="0" w:color="000000"/>
+              <w:bottom w:val="single" w:sz="8" w:space="0" w:color="000000"/>
+              <w:right w:val="single" w:sz="8" w:space="0" w:color="000000"/>
+            </w:tcBorders>
+            <w:hideMark/>
+          </w:tcPr>
+          <w:p>
+            <w:pPr>
+              <w:spacing w:after="0" w:line="276" w:lineRule="auto"/>
+              <w:rPr>
+                <w:rFonts w:eastAsia="Times New Roman" w:cs="Times New Roman"/>
+                <w:szCs w:val="24"/>
+              </w:rPr>
+            </w:pPr>
+            <w:r>
+              <w:rPr>
+                <w:rFonts w:eastAsia="Times New Roman" w:cs="Times New Roman"/>
+                <w:b/>
+                <w:bCs/>
+                <w:color w:val="000000"/>
+                <w:szCs w:val="24"/>
+              </w:rPr>
+              <w:t>Краткое описание:</w:t>
+            </w:r>
+            <w:r>
+              <w:rPr>
+                <w:rFonts w:eastAsia="Times New Roman" w:cs="Times New Roman"/>
+                <w:color w:val="000000"/>
+                <w:szCs w:val="24"/>
+              </w:rPr>
+              <w:t xml:space="preserve"> </w:t>
+            </w:r>
+            <w:r>
+              <w:rPr>
+                <w:rFonts w:eastAsia="Times New Roman" w:cs="Times New Roman"/>
+                <w:color w:val="000000"/>
+                <w:szCs w:val="24"/>
+              </w:rPr>
+              <w:t>Рекламный клиент создаёт рекламную кампанию</w:t>
+            </w:r>
+          </w:p>
+        </w:tc>
+      </w:tr>
+      <w:tr>
+        <w:trPr>
+          <w:jc w:val="center"/>
+        </w:trPr>
+        <w:tc>
+          <w:tcPr>
+            <w:tcW w:w="8882" w:type="dxa"/>
+            <w:tcBorders>
+              <w:top w:val="single" w:sz="8" w:space="0" w:color="000000"/>
+              <w:left w:val="single" w:sz="8" w:space="0" w:color="000000"/>
+              <w:bottom w:val="single" w:sz="8" w:space="0" w:color="000000"/>
+              <w:right w:val="single" w:sz="8" w:space="0" w:color="000000"/>
+            </w:tcBorders>
+            <w:hideMark/>
+          </w:tcPr>
+          <w:p>
+            <w:pPr>
+              <w:spacing w:after="0" w:line="276" w:lineRule="auto"/>
+              <w:rPr>
+                <w:rFonts w:eastAsia="Times New Roman" w:cs="Times New Roman"/>
+                <w:szCs w:val="24"/>
+              </w:rPr>
+            </w:pPr>
+            <w:r>
+              <w:rPr>
+                <w:rFonts w:eastAsia="Times New Roman" w:cs="Times New Roman"/>
+                <w:b/>
+                <w:bCs/>
+                <w:color w:val="000000"/>
+                <w:szCs w:val="24"/>
+              </w:rPr>
+              <w:t>Главный актер:</w:t>
+            </w:r>
+            <w:r>
+              <w:rPr>
+                <w:rFonts w:eastAsia="Times New Roman" w:cs="Times New Roman"/>
+                <w:color w:val="000000"/>
+                <w:szCs w:val="24"/>
+              </w:rPr>
+              <w:t xml:space="preserve"> </w:t>
+            </w:r>
+            <w:r>
+              <w:rPr>
+                <w:rFonts w:eastAsia="Times New Roman" w:cs="Times New Roman"/>
+                <w:color w:val="000000"/>
+                <w:szCs w:val="24"/>
+              </w:rPr>
+              <w:t>Рекламный клиент</w:t>
+            </w:r>
+          </w:p>
+        </w:tc>
+      </w:tr>
+      <w:tr>
+        <w:trPr>
+          <w:jc w:val="center"/>
+        </w:trPr>
+        <w:tc>
+          <w:tcPr>
+            <w:tcW w:w="8882" w:type="dxa"/>
+            <w:tcBorders>
+              <w:top w:val="single" w:sz="8" w:space="0" w:color="000000"/>
+              <w:left w:val="single" w:sz="8" w:space="0" w:color="000000"/>
+              <w:bottom w:val="single" w:sz="8" w:space="0" w:color="000000"/>
+              <w:right w:val="single" w:sz="8" w:space="0" w:color="000000"/>
+            </w:tcBorders>
+            <w:hideMark/>
+          </w:tcPr>
+          <w:p>
+            <w:pPr>
+              <w:spacing w:after="0" w:line="276" w:lineRule="auto"/>
+              <w:rPr>
+                <w:rFonts w:eastAsia="Times New Roman" w:cs="Times New Roman"/>
+                <w:szCs w:val="24"/>
+              </w:rPr>
+            </w:pPr>
+            <w:r>
+              <w:rPr>
+                <w:rFonts w:eastAsia="Times New Roman" w:cs="Times New Roman"/>
+                <w:b/>
+                <w:bCs/>
+                <w:color w:val="000000"/>
+                <w:szCs w:val="24"/>
+              </w:rPr>
+              <w:t>Предусловия:</w:t>
+            </w:r>
+            <w:r>
+              <w:rPr>
+                <w:rFonts w:eastAsia="Times New Roman" w:cs="Times New Roman"/>
+                <w:color w:val="000000"/>
+                <w:szCs w:val="24"/>
+              </w:rPr>
+              <w:t xml:space="preserve"> </w:t>
+            </w:r>
+            <w:r>
+              <w:rPr>
+                <w:rFonts w:eastAsia="Times New Roman" w:cs="Times New Roman"/>
+                <w:color w:val="000000"/>
+                <w:szCs w:val="24"/>
+              </w:rPr>
+              <w:t>Рекламный клиент имеет аккаунт на платформе</w:t>
+            </w:r>
+          </w:p>
+        </w:tc>
+      </w:tr>
+      <w:tr>
+        <w:trPr>
+          <w:trHeight w:val="435"/>
+          <w:jc w:val="center"/>
+        </w:trPr>
+        <w:tc>
+          <w:tcPr>
+            <w:tcW w:w="8882" w:type="dxa"/>
+            <w:tcBorders>
+              <w:top w:val="single" w:sz="8" w:space="0" w:color="000000"/>
+              <w:left w:val="single" w:sz="8" w:space="0" w:color="000000"/>
+              <w:bottom w:val="single" w:sz="8" w:space="0" w:color="000000"/>
+              <w:right w:val="single" w:sz="8" w:space="0" w:color="000000"/>
+            </w:tcBorders>
+            <w:hideMark/>
+          </w:tcPr>
+          <w:p>
+            <w:pPr>
+              <w:spacing w:after="0" w:line="276" w:lineRule="auto"/>
+              <w:rPr>
+                <w:rFonts w:eastAsia="Times New Roman" w:cs="Times New Roman"/>
+                <w:b/>
+                <w:bCs/>
+                <w:color w:val="000000"/>
+                <w:szCs w:val="24"/>
+              </w:rPr>
+            </w:pPr>
+            <w:r>
+              <w:rPr>
+                <w:rFonts w:eastAsia="Times New Roman" w:cs="Times New Roman"/>
+                <w:b/>
+                <w:bCs/>
+                <w:color w:val="000000"/>
+                <w:szCs w:val="24"/>
+              </w:rPr>
+              <w:t>Основной поток: </w:t>
+            </w:r>
+          </w:p>
+          <w:p>
+            <w:pPr>
+              <w:pStyle w:val="ListParagraph"/>
+              <w:numPr>
+                <w:ilvl w:val="0"/>
+                <w:numId w:val="40"/>
+              </w:numPr>
+              <w:spacing w:after="0" w:line="276" w:lineRule="auto"/>
+              <w:rPr>
+                <w:rFonts w:cs="Times New Roman"/>
+                <w:szCs w:val="24"/>
+              </w:rPr>
+            </w:pPr>
+            <w:r>
+              <w:rPr>
+                <w:rFonts w:cs="Times New Roman"/>
+                <w:szCs w:val="24"/>
+              </w:rPr>
+              <w:t>Рекламный клиент заполняет форму создания кампании и отправляет запрос на создание.</w:t>
+            </w:r>
+          </w:p>
+          <w:p>
+            <w:pPr>
+              <w:pStyle w:val="ListParagraph"/>
+              <w:numPr>
+                <w:ilvl w:val="0"/>
+                <w:numId w:val="40"/>
+              </w:numPr>
+              <w:spacing w:after="0" w:line="276" w:lineRule="auto"/>
+              <w:rPr>
+                <w:rFonts w:cs="Times New Roman"/>
+                <w:szCs w:val="24"/>
+              </w:rPr>
+            </w:pPr>
+            <w:r>
+              <w:rPr>
+                <w:rFonts w:cs="Times New Roman"/>
+                <w:szCs w:val="24"/>
+              </w:rPr>
+              <w:t>Система валидирует введённые данные.</w:t>
+            </w:r>
+          </w:p>
+          <w:p>
+            <w:pPr>
+              <w:pStyle w:val="ListParagraph"/>
+              <w:numPr>
+                <w:ilvl w:val="0"/>
+                <w:numId w:val="40"/>
+              </w:numPr>
+              <w:spacing w:after="0" w:line="276" w:lineRule="auto"/>
+              <w:rPr>
+                <w:rFonts w:cs="Times New Roman"/>
+                <w:szCs w:val="24"/>
+              </w:rPr>
+            </w:pPr>
+            <w:r>
+              <w:rPr>
+                <w:rFonts w:cs="Times New Roman"/>
+                <w:szCs w:val="24"/>
+              </w:rPr>
+              <w:t>Система создаёт рекламную кампанию.</w:t>
+            </w:r>
+          </w:p>
+          <w:p>
+            <w:pPr>
+              <w:spacing w:after="0" w:line="276" w:lineRule="auto"/>
+              <w:rPr>
+                <w:rFonts w:cs="Times New Roman"/>
+                <w:szCs w:val="24"/>
+              </w:rPr>
+            </w:pPr>
+          </w:p>
+        </w:tc>
+      </w:tr>
+      <w:tr>
+        <w:trPr>
+          <w:trHeight w:val="435"/>
+          <w:jc w:val="center"/>
+        </w:trPr>
+        <w:tc>
+          <w:tcPr>
+            <w:tcW w:w="8882" w:type="dxa"/>
+            <w:tcBorders>
+              <w:top w:val="single" w:sz="8" w:space="0" w:color="000000"/>
+              <w:left w:val="single" w:sz="8" w:space="0" w:color="000000"/>
+              <w:bottom w:val="single" w:sz="8" w:space="0" w:color="000000"/>
+              <w:right w:val="single" w:sz="8" w:space="0" w:color="000000"/>
+            </w:tcBorders>
+          </w:tcPr>
+          <w:p>
+            <w:pPr>
+              <w:spacing w:after="0"/>
+              <w:rPr>
+                <w:rFonts w:cs="Times New Roman"/>
+                <w:b/>
+                <w:bCs/>
+                <w:szCs w:val="24"/>
+              </w:rPr>
+            </w:pPr>
+            <w:r>
+              <w:rPr>
+                <w:rFonts w:eastAsia="Times New Roman" w:cs="Times New Roman"/>
+                <w:b/>
+                <w:bCs/>
+                <w:color w:val="000000"/>
+                <w:szCs w:val="24"/>
+              </w:rPr>
+              <w:t xml:space="preserve">Альтернативный поток: </w:t>
+            </w:r>
+          </w:p>
+          <w:p>
+            <w:pPr>
+              <w:pStyle w:val="ListParagraph"/>
+              <w:numPr>
+                <w:ilvl w:val="0"/>
+                <w:numId w:val="12"/>
+              </w:numPr>
+              <w:spacing w:after="0" w:line="276" w:lineRule="auto"/>
+              <w:rPr>
+                <w:rFonts w:eastAsia="Times New Roman" w:cs="Times New Roman"/>
+                <w:color w:val="000000"/>
+                <w:szCs w:val="24"/>
+              </w:rPr>
+            </w:pPr>
+            <w:r>
+              <w:rPr>
+                <w:rFonts w:eastAsia="Times New Roman" w:cs="Times New Roman"/>
+                <w:color w:val="000000"/>
+                <w:szCs w:val="24"/>
+              </w:rPr>
+              <w:t>Если</w:t>
+            </w:r>
+            <w:r>
+              <w:rPr>
+                <w:rFonts w:eastAsia="Times New Roman" w:cs="Times New Roman"/>
+                <w:color w:val="000000"/>
+                <w:szCs w:val="24"/>
+              </w:rPr>
+              <w:t xml:space="preserve"> данные не прошли валидацию, кампания не создаётся.</w:t>
+            </w:r>
+          </w:p>
+        </w:tc>
+      </w:tr>
+      <w:tr>
+        <w:trPr>
+          <w:trHeight w:val="435"/>
+          <w:jc w:val="center"/>
+        </w:trPr>
+        <w:tc>
+          <w:tcPr>
+            <w:tcW w:w="8882" w:type="dxa"/>
+            <w:tcBorders>
+              <w:top w:val="single" w:sz="8" w:space="0" w:color="000000"/>
+              <w:left w:val="single" w:sz="8" w:space="0" w:color="000000"/>
+              <w:bottom w:val="single" w:sz="8" w:space="0" w:color="000000"/>
+              <w:right w:val="single" w:sz="8" w:space="0" w:color="000000"/>
+            </w:tcBorders>
+          </w:tcPr>
+          <w:p>
+            <w:pPr>
+              <w:spacing w:after="0"/>
+              <w:rPr>
+                <w:rFonts w:eastAsia="Times New Roman" w:cs="Times New Roman"/>
+                <w:b/>
+                <w:bCs/>
+                <w:color w:val="000000"/>
+                <w:szCs w:val="24"/>
+              </w:rPr>
+            </w:pPr>
+            <w:r>
+              <w:rPr>
+                <w:rFonts w:eastAsia="Times New Roman" w:cs="Times New Roman"/>
+                <w:b/>
+                <w:bCs/>
+                <w:color w:val="000000"/>
+                <w:szCs w:val="24"/>
+              </w:rPr>
+              <w:t>Постусловия</w:t>
+            </w:r>
+            <w:r>
+              <w:rPr>
+                <w:rFonts w:eastAsia="Times New Roman" w:cs="Times New Roman"/>
+                <w:b/>
+                <w:bCs/>
+                <w:color w:val="000000"/>
+                <w:szCs w:val="24"/>
+              </w:rPr>
+              <w:t>:</w:t>
+            </w:r>
+          </w:p>
+          <w:p>
+            <w:pPr>
+              <w:spacing w:after="0"/>
+              <w:rPr>
+                <w:rFonts w:eastAsia="Times New Roman" w:cs="Times New Roman"/>
+                <w:color w:val="000000"/>
+                <w:szCs w:val="24"/>
+              </w:rPr>
+            </w:pPr>
+            <w:r>
+              <w:rPr>
+                <w:rFonts w:eastAsia="Times New Roman" w:cs="Times New Roman"/>
+                <w:color w:val="000000"/>
+                <w:szCs w:val="24"/>
+              </w:rPr>
+              <w:t>Рекламная кампания создана в системе.</w:t>
+            </w:r>
+          </w:p>
+        </w:tc>
+      </w:tr>
+    </w:tbl>
+    <w:p>
+      <w:pPr>
+        <w:spacing w:after="0"/>
+        <w:rPr>
+          <w:rFonts w:cs="Times New Roman"/>
+          <w:szCs w:val="24"/>
+        </w:rPr>
+      </w:pPr>
+    </w:p>
+    <w:p>
+      <w:pPr>
+        <w:spacing w:after="0"/>
+        <w:rPr>
+          <w:rFonts w:cs="Times New Roman"/>
+          <w:szCs w:val="24"/>
+        </w:rPr>
+      </w:pPr>
+    </w:p>
+    <w:tbl>
+      <w:tblPr>
+        <w:tblW w:w="8882" w:type="dxa"/>
+        <w:jc w:val="center"/>
+        <w:tblCellMar>
+          <w:left w:w="98" w:type="dxa"/>
+        </w:tblCellMar>
+        <w:tblLook w:val="04A0" w:firstRow="1" w:lastRow="0" w:firstColumn="1" w:lastColumn="0" w:noHBand="0" w:noVBand="1"/>
+      </w:tblPr>
+      <w:tblGrid>
+        <w:gridCol w:w="8882"/>
+      </w:tblGrid>
+      <w:tr>
+        <w:trPr>
+          <w:trHeight w:val="465"/>
+          <w:jc w:val="center"/>
+        </w:trPr>
+        <w:tc>
+          <w:tcPr>
+            <w:tcW w:w="8882" w:type="dxa"/>
+            <w:tcBorders>
+              <w:top w:val="single" w:sz="8" w:space="0" w:color="000000"/>
+              <w:left w:val="single" w:sz="8" w:space="0" w:color="000000"/>
+              <w:bottom w:val="single" w:sz="8" w:space="0" w:color="000000"/>
+              <w:right w:val="single" w:sz="8" w:space="0" w:color="000000"/>
+            </w:tcBorders>
+            <w:hideMark/>
+          </w:tcPr>
+          <w:p>
+            <w:pPr>
+              <w:tabs>
+                <w:tab w:val="left" w:pos="888"/>
+                <w:tab w:val="center" w:pos="4338"/>
+              </w:tabs>
+              <w:spacing w:after="0" w:line="276" w:lineRule="auto"/>
+              <w:rPr>
+                <w:rFonts w:eastAsia="Times New Roman" w:cs="Times New Roman"/>
+                <w:b/>
+                <w:bCs/>
+                <w:szCs w:val="24"/>
+              </w:rPr>
+            </w:pPr>
+            <w:r>
+              <w:rPr>
+                <w:rFonts w:eastAsia="Times New Roman" w:cs="Times New Roman"/>
+                <w:b/>
+                <w:bCs/>
+                <w:color w:val="000000"/>
+                <w:szCs w:val="24"/>
+              </w:rPr>
+              <w:lastRenderedPageBreak/>
+              <w:tab/>
+            </w:r>
+            <w:r>
+              <w:rPr>
+                <w:rFonts w:eastAsia="Times New Roman" w:cs="Times New Roman"/>
+                <w:b/>
+                <w:bCs/>
+                <w:color w:val="000000"/>
+                <w:szCs w:val="24"/>
+              </w:rPr>
+              <w:tab/>
+            </w:r>
+            <w:r>
+              <w:rPr>
+                <w:rFonts w:eastAsia="Times New Roman" w:cs="Times New Roman"/>
+                <w:b/>
+                <w:bCs/>
+                <w:color w:val="000000"/>
+                <w:szCs w:val="24"/>
+              </w:rPr>
+              <w:t>Просмотр рекламной статистики</w:t>
+            </w:r>
+          </w:p>
+        </w:tc>
+      </w:tr>
+      <w:tr>
+        <w:trPr>
+          <w:jc w:val="center"/>
+        </w:trPr>
+        <w:tc>
+          <w:tcPr>
+            <w:tcW w:w="8882" w:type="dxa"/>
+            <w:tcBorders>
+              <w:top w:val="single" w:sz="8" w:space="0" w:color="000000"/>
+              <w:left w:val="single" w:sz="8" w:space="0" w:color="000000"/>
+              <w:bottom w:val="single" w:sz="8" w:space="0" w:color="000000"/>
+              <w:right w:val="single" w:sz="8" w:space="0" w:color="000000"/>
+            </w:tcBorders>
+            <w:hideMark/>
+          </w:tcPr>
+          <w:p>
+            <w:pPr>
+              <w:spacing w:after="0" w:line="276" w:lineRule="auto"/>
+              <w:rPr>
+                <w:rFonts w:eastAsia="Times New Roman" w:cs="Times New Roman"/>
+                <w:szCs w:val="24"/>
+              </w:rPr>
+            </w:pPr>
+            <w:r>
+              <w:rPr>
+                <w:rFonts w:eastAsia="Times New Roman" w:cs="Times New Roman"/>
+                <w:b/>
+                <w:bCs/>
+                <w:color w:val="000000"/>
+                <w:szCs w:val="24"/>
+              </w:rPr>
+              <w:t>ID</w:t>
+            </w:r>
+            <w:r>
+              <w:rPr>
+                <w:rFonts w:eastAsia="Times New Roman" w:cs="Times New Roman"/>
+                <w:color w:val="000000"/>
+                <w:szCs w:val="24"/>
+              </w:rPr>
+              <w:t xml:space="preserve">: </w:t>
+            </w:r>
+            <w:r>
+              <w:rPr>
+                <w:rFonts w:eastAsia="Times New Roman" w:cs="Times New Roman"/>
+                <w:color w:val="000000"/>
+                <w:szCs w:val="24"/>
+                <w:lang w:val="en-US"/>
+              </w:rPr>
+              <w:t>UC-0</w:t>
+            </w:r>
+            <w:r>
+              <w:rPr>
+                <w:rFonts w:eastAsia="Times New Roman" w:cs="Times New Roman"/>
+                <w:color w:val="000000"/>
+                <w:szCs w:val="24"/>
+              </w:rPr>
+              <w:t>20</w:t>
+            </w:r>
+          </w:p>
+        </w:tc>
+      </w:tr>
+      <w:tr>
+        <w:trPr>
+          <w:jc w:val="center"/>
+        </w:trPr>
+        <w:tc>
+          <w:tcPr>
+            <w:tcW w:w="8882" w:type="dxa"/>
+            <w:tcBorders>
+              <w:top w:val="single" w:sz="8" w:space="0" w:color="000000"/>
+              <w:left w:val="single" w:sz="8" w:space="0" w:color="000000"/>
+              <w:bottom w:val="single" w:sz="8" w:space="0" w:color="000000"/>
+              <w:right w:val="single" w:sz="8" w:space="0" w:color="000000"/>
+            </w:tcBorders>
+            <w:hideMark/>
+          </w:tcPr>
+          <w:p>
+            <w:pPr>
+              <w:spacing w:after="0" w:line="276" w:lineRule="auto"/>
+              <w:rPr>
+                <w:rFonts w:eastAsia="Times New Roman" w:cs="Times New Roman"/>
+                <w:szCs w:val="24"/>
+              </w:rPr>
+            </w:pPr>
+            <w:r>
+              <w:rPr>
+                <w:rFonts w:eastAsia="Times New Roman" w:cs="Times New Roman"/>
+                <w:b/>
+                <w:bCs/>
+                <w:color w:val="000000"/>
+                <w:szCs w:val="24"/>
+              </w:rPr>
+              <w:t>Краткое описание:</w:t>
+            </w:r>
+            <w:r>
+              <w:rPr>
+                <w:rFonts w:eastAsia="Times New Roman" w:cs="Times New Roman"/>
+                <w:color w:val="000000"/>
+                <w:szCs w:val="24"/>
+              </w:rPr>
+              <w:t xml:space="preserve"> </w:t>
+            </w:r>
+            <w:r>
+              <w:rPr>
+                <w:rFonts w:eastAsia="Times New Roman" w:cs="Times New Roman"/>
+                <w:color w:val="000000"/>
+                <w:szCs w:val="24"/>
+              </w:rPr>
+              <w:t xml:space="preserve">Рекламный клиент </w:t>
+            </w:r>
+            <w:r>
+              <w:rPr>
+                <w:rFonts w:eastAsia="Times New Roman" w:cs="Times New Roman"/>
+                <w:color w:val="000000"/>
+                <w:szCs w:val="24"/>
+              </w:rPr>
+              <w:t>просмтаривает статистику</w:t>
+            </w:r>
+          </w:p>
+        </w:tc>
+      </w:tr>
+      <w:tr>
+        <w:trPr>
+          <w:jc w:val="center"/>
+        </w:trPr>
+        <w:tc>
+          <w:tcPr>
+            <w:tcW w:w="8882" w:type="dxa"/>
+            <w:tcBorders>
+              <w:top w:val="single" w:sz="8" w:space="0" w:color="000000"/>
+              <w:left w:val="single" w:sz="8" w:space="0" w:color="000000"/>
+              <w:bottom w:val="single" w:sz="8" w:space="0" w:color="000000"/>
+              <w:right w:val="single" w:sz="8" w:space="0" w:color="000000"/>
+            </w:tcBorders>
+            <w:hideMark/>
+          </w:tcPr>
+          <w:p>
+            <w:pPr>
+              <w:spacing w:after="0" w:line="276" w:lineRule="auto"/>
+              <w:rPr>
+                <w:rFonts w:eastAsia="Times New Roman" w:cs="Times New Roman"/>
+                <w:szCs w:val="24"/>
+              </w:rPr>
+            </w:pPr>
+            <w:r>
+              <w:rPr>
+                <w:rFonts w:eastAsia="Times New Roman" w:cs="Times New Roman"/>
+                <w:b/>
+                <w:bCs/>
+                <w:color w:val="000000"/>
+                <w:szCs w:val="24"/>
+              </w:rPr>
+              <w:t>Главный актер:</w:t>
+            </w:r>
+            <w:r>
+              <w:rPr>
+                <w:rFonts w:eastAsia="Times New Roman" w:cs="Times New Roman"/>
+                <w:color w:val="000000"/>
+                <w:szCs w:val="24"/>
+              </w:rPr>
+              <w:t xml:space="preserve"> </w:t>
+            </w:r>
+            <w:r>
+              <w:rPr>
+                <w:rFonts w:eastAsia="Times New Roman" w:cs="Times New Roman"/>
+                <w:color w:val="000000"/>
+                <w:szCs w:val="24"/>
+              </w:rPr>
+              <w:t>Рекламный клиент</w:t>
+            </w:r>
+          </w:p>
+        </w:tc>
+      </w:tr>
+      <w:tr>
+        <w:trPr>
+          <w:jc w:val="center"/>
+        </w:trPr>
+        <w:tc>
+          <w:tcPr>
+            <w:tcW w:w="8882" w:type="dxa"/>
+            <w:tcBorders>
+              <w:top w:val="single" w:sz="8" w:space="0" w:color="000000"/>
+              <w:left w:val="single" w:sz="8" w:space="0" w:color="000000"/>
+              <w:bottom w:val="single" w:sz="8" w:space="0" w:color="000000"/>
+              <w:right w:val="single" w:sz="8" w:space="0" w:color="000000"/>
+            </w:tcBorders>
+            <w:hideMark/>
+          </w:tcPr>
+          <w:p>
+            <w:pPr>
+              <w:spacing w:after="0" w:line="276" w:lineRule="auto"/>
+              <w:rPr>
+                <w:rFonts w:eastAsia="Times New Roman" w:cs="Times New Roman"/>
+                <w:szCs w:val="24"/>
+              </w:rPr>
+            </w:pPr>
+            <w:r>
+              <w:rPr>
+                <w:rFonts w:eastAsia="Times New Roman" w:cs="Times New Roman"/>
+                <w:b/>
+                <w:bCs/>
+                <w:color w:val="000000"/>
+                <w:szCs w:val="24"/>
+              </w:rPr>
+              <w:t>Предусловия:</w:t>
+            </w:r>
+            <w:r>
+              <w:rPr>
+                <w:rFonts w:eastAsia="Times New Roman" w:cs="Times New Roman"/>
+                <w:color w:val="000000"/>
+                <w:szCs w:val="24"/>
+              </w:rPr>
+              <w:t xml:space="preserve"> </w:t>
+            </w:r>
+            <w:r>
+              <w:rPr>
+                <w:rFonts w:eastAsia="Times New Roman" w:cs="Times New Roman"/>
+                <w:color w:val="000000"/>
+                <w:szCs w:val="24"/>
+              </w:rPr>
+              <w:t xml:space="preserve">Рекламный клиент имеет </w:t>
+            </w:r>
+            <w:r>
+              <w:rPr>
+                <w:rFonts w:eastAsia="Times New Roman" w:cs="Times New Roman"/>
+                <w:color w:val="000000"/>
+                <w:szCs w:val="24"/>
+              </w:rPr>
+              <w:t>рекламную кампанию</w:t>
+            </w:r>
+          </w:p>
+        </w:tc>
+      </w:tr>
+      <w:tr>
+        <w:trPr>
+          <w:trHeight w:val="435"/>
+          <w:jc w:val="center"/>
+        </w:trPr>
+        <w:tc>
+          <w:tcPr>
+            <w:tcW w:w="8882" w:type="dxa"/>
+            <w:tcBorders>
+              <w:top w:val="single" w:sz="8" w:space="0" w:color="000000"/>
+              <w:left w:val="single" w:sz="8" w:space="0" w:color="000000"/>
+              <w:bottom w:val="single" w:sz="8" w:space="0" w:color="000000"/>
+              <w:right w:val="single" w:sz="8" w:space="0" w:color="000000"/>
+            </w:tcBorders>
+            <w:hideMark/>
+          </w:tcPr>
+          <w:p>
+            <w:pPr>
+              <w:spacing w:after="0" w:line="276" w:lineRule="auto"/>
+              <w:rPr>
+                <w:rFonts w:eastAsia="Times New Roman" w:cs="Times New Roman"/>
+                <w:b/>
+                <w:bCs/>
+                <w:color w:val="000000"/>
+                <w:szCs w:val="24"/>
+              </w:rPr>
+            </w:pPr>
+            <w:r>
+              <w:rPr>
+                <w:rFonts w:eastAsia="Times New Roman" w:cs="Times New Roman"/>
+                <w:b/>
+                <w:bCs/>
+                <w:color w:val="000000"/>
+                <w:szCs w:val="24"/>
+              </w:rPr>
+              <w:t>Основной поток: </w:t>
+            </w:r>
+          </w:p>
+          <w:p>
+            <w:pPr>
+              <w:pStyle w:val="ListParagraph"/>
+              <w:numPr>
+                <w:ilvl w:val="0"/>
+                <w:numId w:val="42"/>
+              </w:numPr>
+              <w:spacing w:after="0" w:line="276" w:lineRule="auto"/>
+              <w:rPr>
+                <w:rFonts w:cs="Times New Roman"/>
+                <w:szCs w:val="24"/>
+              </w:rPr>
+            </w:pPr>
+            <w:r>
+              <w:rPr>
+                <w:rFonts w:cs="Times New Roman"/>
+                <w:szCs w:val="24"/>
+              </w:rPr>
+              <w:t>Рекламный клиент</w:t>
+            </w:r>
+            <w:r>
+              <w:rPr>
+                <w:rFonts w:cs="Times New Roman"/>
+                <w:szCs w:val="24"/>
+              </w:rPr>
+              <w:t xml:space="preserve"> вводит параметры и</w:t>
+            </w:r>
+            <w:r>
+              <w:rPr>
+                <w:rFonts w:cs="Times New Roman"/>
+                <w:szCs w:val="24"/>
+              </w:rPr>
+              <w:t xml:space="preserve"> </w:t>
+            </w:r>
+            <w:r>
+              <w:rPr>
+                <w:rFonts w:cs="Times New Roman"/>
+                <w:szCs w:val="24"/>
+              </w:rPr>
+              <w:t>отправляет запрос на получение рекламной статистики.</w:t>
+            </w:r>
+          </w:p>
+          <w:p>
+            <w:pPr>
+              <w:pStyle w:val="ListParagraph"/>
+              <w:numPr>
+                <w:ilvl w:val="0"/>
+                <w:numId w:val="42"/>
+              </w:numPr>
+              <w:spacing w:after="0" w:line="276" w:lineRule="auto"/>
+              <w:rPr>
+                <w:rFonts w:cs="Times New Roman"/>
+                <w:szCs w:val="24"/>
+              </w:rPr>
+            </w:pPr>
+            <w:r>
+              <w:rPr>
+                <w:rFonts w:cs="Times New Roman"/>
+                <w:szCs w:val="24"/>
+              </w:rPr>
+              <w:t>Система валидирует введённые параметры.</w:t>
+            </w:r>
+          </w:p>
+          <w:p>
+            <w:pPr>
+              <w:pStyle w:val="ListParagraph"/>
+              <w:numPr>
+                <w:ilvl w:val="0"/>
+                <w:numId w:val="42"/>
+              </w:numPr>
+              <w:spacing w:after="0" w:line="276" w:lineRule="auto"/>
+              <w:rPr>
+                <w:rFonts w:cs="Times New Roman"/>
+                <w:szCs w:val="24"/>
+              </w:rPr>
+            </w:pPr>
+            <w:r>
+              <w:rPr>
+                <w:rFonts w:cs="Times New Roman"/>
+                <w:szCs w:val="24"/>
+              </w:rPr>
+              <w:t>Система делает выборку данных, используя параметры.</w:t>
+            </w:r>
+          </w:p>
+          <w:p>
+            <w:pPr>
+              <w:pStyle w:val="ListParagraph"/>
+              <w:numPr>
+                <w:ilvl w:val="0"/>
+                <w:numId w:val="42"/>
+              </w:numPr>
+              <w:spacing w:after="0" w:line="276" w:lineRule="auto"/>
+              <w:rPr>
+                <w:rFonts w:cs="Times New Roman"/>
+                <w:szCs w:val="24"/>
+              </w:rPr>
+            </w:pPr>
+            <w:r>
+              <w:rPr>
+                <w:rFonts w:cs="Times New Roman"/>
+                <w:szCs w:val="24"/>
+              </w:rPr>
+              <w:t>Система создаёт статистику.</w:t>
+            </w:r>
+          </w:p>
+          <w:p>
+            <w:pPr>
+              <w:spacing w:after="0" w:line="276" w:lineRule="auto"/>
+              <w:rPr>
+                <w:rFonts w:cs="Times New Roman"/>
+                <w:szCs w:val="24"/>
+              </w:rPr>
+            </w:pPr>
+          </w:p>
+        </w:tc>
+      </w:tr>
+      <w:tr>
+        <w:trPr>
+          <w:trHeight w:val="435"/>
+          <w:jc w:val="center"/>
+        </w:trPr>
+        <w:tc>
+          <w:tcPr>
+            <w:tcW w:w="8882" w:type="dxa"/>
+            <w:tcBorders>
+              <w:top w:val="single" w:sz="8" w:space="0" w:color="000000"/>
+              <w:left w:val="single" w:sz="8" w:space="0" w:color="000000"/>
+              <w:bottom w:val="single" w:sz="8" w:space="0" w:color="000000"/>
+              <w:right w:val="single" w:sz="8" w:space="0" w:color="000000"/>
+            </w:tcBorders>
+          </w:tcPr>
+          <w:p>
+            <w:pPr>
+              <w:spacing w:after="0"/>
+              <w:rPr>
+                <w:rFonts w:cs="Times New Roman"/>
+                <w:b/>
+                <w:bCs/>
+                <w:szCs w:val="24"/>
+              </w:rPr>
+            </w:pPr>
+            <w:r>
+              <w:rPr>
+                <w:rFonts w:eastAsia="Times New Roman" w:cs="Times New Roman"/>
+                <w:b/>
+                <w:bCs/>
+                <w:color w:val="000000"/>
+                <w:szCs w:val="24"/>
+              </w:rPr>
+              <w:t xml:space="preserve">Альтернативный поток: </w:t>
+            </w:r>
+          </w:p>
+          <w:p>
+            <w:pPr>
+              <w:pStyle w:val="ListParagraph"/>
+              <w:numPr>
+                <w:ilvl w:val="0"/>
+                <w:numId w:val="12"/>
+              </w:numPr>
+              <w:spacing w:after="0" w:line="276" w:lineRule="auto"/>
+              <w:rPr>
+                <w:rFonts w:eastAsia="Times New Roman" w:cs="Times New Roman"/>
+                <w:color w:val="000000"/>
+                <w:szCs w:val="24"/>
+              </w:rPr>
+            </w:pPr>
+            <w:r>
+              <w:rPr>
+                <w:rFonts w:eastAsia="Times New Roman" w:cs="Times New Roman"/>
+                <w:color w:val="000000"/>
+                <w:szCs w:val="24"/>
+              </w:rPr>
+              <w:t>Если данные не прошли валидацию</w:t>
+            </w:r>
+            <w:r>
+              <w:rPr>
+                <w:rFonts w:eastAsia="Times New Roman" w:cs="Times New Roman"/>
+                <w:color w:val="000000"/>
+                <w:szCs w:val="24"/>
+              </w:rPr>
+              <w:t>, статистика не будет собрана</w:t>
+            </w:r>
+            <w:r>
+              <w:rPr>
+                <w:rFonts w:eastAsia="Times New Roman" w:cs="Times New Roman"/>
+                <w:color w:val="000000"/>
+                <w:szCs w:val="24"/>
+              </w:rPr>
+              <w:t>.</w:t>
+            </w:r>
+          </w:p>
+        </w:tc>
+      </w:tr>
+      <w:tr>
+        <w:trPr>
+          <w:trHeight w:val="435"/>
+          <w:jc w:val="center"/>
+        </w:trPr>
+        <w:tc>
+          <w:tcPr>
+            <w:tcW w:w="8882" w:type="dxa"/>
+            <w:tcBorders>
+              <w:top w:val="single" w:sz="8" w:space="0" w:color="000000"/>
+              <w:left w:val="single" w:sz="8" w:space="0" w:color="000000"/>
+              <w:bottom w:val="single" w:sz="8" w:space="0" w:color="000000"/>
+              <w:right w:val="single" w:sz="8" w:space="0" w:color="000000"/>
+            </w:tcBorders>
+          </w:tcPr>
+          <w:p>
+            <w:pPr>
+              <w:spacing w:after="0"/>
+              <w:rPr>
+                <w:rFonts w:eastAsia="Times New Roman" w:cs="Times New Roman"/>
+                <w:b/>
+                <w:bCs/>
+                <w:color w:val="000000"/>
+                <w:szCs w:val="24"/>
+              </w:rPr>
+            </w:pPr>
+            <w:r>
+              <w:rPr>
+                <w:rFonts w:eastAsia="Times New Roman" w:cs="Times New Roman"/>
+                <w:b/>
+                <w:bCs/>
+                <w:color w:val="000000"/>
+                <w:szCs w:val="24"/>
+              </w:rPr>
+              <w:t>Постусловия</w:t>
+            </w:r>
+            <w:r>
+              <w:rPr>
+                <w:rFonts w:eastAsia="Times New Roman" w:cs="Times New Roman"/>
+                <w:b/>
+                <w:bCs/>
+                <w:color w:val="000000"/>
+                <w:szCs w:val="24"/>
+              </w:rPr>
+              <w:t>:</w:t>
+            </w:r>
+          </w:p>
+          <w:p>
+            <w:pPr>
+              <w:spacing w:after="0"/>
+              <w:rPr>
+                <w:rFonts w:eastAsia="Times New Roman" w:cs="Times New Roman"/>
+                <w:color w:val="000000"/>
+                <w:szCs w:val="24"/>
+              </w:rPr>
+            </w:pPr>
+            <w:r>
+              <w:rPr>
+                <w:rFonts w:eastAsia="Times New Roman" w:cs="Times New Roman"/>
+                <w:color w:val="000000"/>
+                <w:szCs w:val="24"/>
+              </w:rPr>
+              <w:t>Ничего не изменяется в системе.</w:t>
+            </w:r>
+          </w:p>
+        </w:tc>
+      </w:tr>
+    </w:tbl>
+    <w:p>
+      <w:pPr>
+        <w:spacing w:after="0"/>
+        <w:rPr>
+          <w:rFonts w:cs="Times New Roman"/>
+          <w:szCs w:val="24"/>
+        </w:rPr>
+      </w:pPr>
+    </w:p>
+    <w:p>
+      <w:pPr>
+        <w:spacing w:after="0"/>
+        <w:rPr>
+          <w:rFonts w:cs="Times New Roman"/>
+          <w:szCs w:val="24"/>
+        </w:rPr>
+      </w:pPr>
+    </w:p>
+    <w:p>
+      <w:pPr>
+        <w:spacing w:after="0"/>
+        <w:rPr>
+          <w:rFonts w:cs="Times New Roman"/>
+          <w:szCs w:val="24"/>
+        </w:rPr>
+      </w:pPr>
+    </w:p>
+    <w:p>
+      <w:pPr>
+        <w:spacing w:after="0"/>
+        <w:rPr>
+          <w:rFonts w:cs="Times New Roman"/>
+          <w:szCs w:val="24"/>
+        </w:rPr>
+      </w:pPr>
+    </w:p>
+    <w:p>
+      <w:pPr>
         <w:pStyle w:val="Heading3"/>
-        <w:rPr>
-          <w:lang w:val="en-US"/>
-        </w:rPr>
+        <w:tabs>
+          <w:tab w:val="left" w:pos="2695"/>
+        </w:tabs>
       </w:pPr>
       <w:bookmarkStart w:id="43" w:name="_Toc224129542"/>
       <w:bookmarkStart w:id="44" w:name="_Toc223486842"/>
@@ -28179,6 +30494,12 @@
         <w:t>diagram</w:t>
       </w:r>
       <w:bookmarkEnd w:id="43"/>
+      <w:r>
+        <w:rPr>
+          <w:lang w:val="en-US"/>
+        </w:rPr>
+        <w:tab/>
+      </w:r>
     </w:p>
     <w:p>
       <w:pPr>
@@ -28192,10 +30513,10 @@
           <w:lang w:val="en-US"/>
         </w:rPr>
         <w:drawing>
-          <wp:inline distT="0" distB="0" distL="0" distR="0" wp14:anchorId="5738D581" wp14:editId="797FCF62">
-            <wp:extent cx="5940425" cy="4090670"/>
-            <wp:effectExtent l="0" t="0" r="3175" b="5080"/>
-            <wp:docPr id="4" name="Picture 4"/>
+          <wp:inline distT="0" distB="0" distL="0" distR="0" wp14:anchorId="2918C138" wp14:editId="6BE09B00">
+            <wp:extent cx="5940425" cy="7356475"/>
+            <wp:effectExtent l="0" t="0" r="3175" b="0"/>
+            <wp:docPr id="5" name="Picture 5"/>
             <wp:cNvGraphicFramePr>
               <a:graphicFrameLocks xmlns:a="http://schemas.openxmlformats.org/drawingml/2006/main" noChangeAspect="1"/>
             </wp:cNvGraphicFramePr>
@@ -28203,11 +30524,11 @@
               <a:graphicData uri="http://schemas.openxmlformats.org/drawingml/2006/picture">
                 <pic:pic xmlns:pic="http://schemas.openxmlformats.org/drawingml/2006/picture">
                   <pic:nvPicPr>
-                    <pic:cNvPr id="4" name="Picture 4"/>
+                    <pic:cNvPr id="5" name="Picture 5"/>
                     <pic:cNvPicPr/>
                   </pic:nvPicPr>
                   <pic:blipFill>
-                    <a:blip r:embed="rId9" cstate="print">
+                    <a:blip r:embed="rId9">
                       <a:extLst>
                         <a:ext uri="{28A0092B-C50C-407E-A947-70E740481C1C}">
                           <a14:useLocalDpi xmlns:a14="http://schemas.microsoft.com/office/drawing/2010/main" val="0"/>
@@ -28221,7 +30542,7 @@
                   <pic:spPr>
                     <a:xfrm>
                       <a:off x="0" y="0"/>
-                      <a:ext cx="5940425" cy="4090670"/>
+                      <a:ext cx="5940425" cy="7356475"/>
                     </a:xfrm>
                     <a:prstGeom prst="rect">
                       <a:avLst/>
@@ -29441,6 +31762,92 @@
     </w:lvl>
   </w:abstractNum>
   <w:abstractNum w:abstractNumId="9" w15:restartNumberingAfterBreak="0">
+    <w:nsid w:val="159E7654"/>
+    <w:multiLevelType w:val="hybridMultilevel"/>
+    <w:tmpl w:val="767E28F8"/>
+    <w:lvl w:ilvl="0" w:tplc="0419000F">
+      <w:start w:val="1"/>
+      <w:numFmt w:val="decimal"/>
+      <w:lvlText w:val="%1."/>
+      <w:lvlJc w:val="left"/>
+      <w:pPr>
+        <w:ind w:left="720" w:hanging="360"/>
+      </w:pPr>
+    </w:lvl>
+    <w:lvl w:ilvl="1" w:tplc="04190019" w:tentative="1">
+      <w:start w:val="1"/>
+      <w:numFmt w:val="lowerLetter"/>
+      <w:lvlText w:val="%2."/>
+      <w:lvlJc w:val="left"/>
+      <w:pPr>
+        <w:ind w:left="1440" w:hanging="360"/>
+      </w:pPr>
+    </w:lvl>
+    <w:lvl w:ilvl="2" w:tplc="0419001B" w:tentative="1">
+      <w:start w:val="1"/>
+      <w:numFmt w:val="lowerRoman"/>
+      <w:lvlText w:val="%3."/>
+      <w:lvlJc w:val="right"/>
+      <w:pPr>
+        <w:ind w:left="2160" w:hanging="180"/>
+      </w:pPr>
+    </w:lvl>
+    <w:lvl w:ilvl="3" w:tplc="0419000F" w:tentative="1">
+      <w:start w:val="1"/>
+      <w:numFmt w:val="decimal"/>
+      <w:lvlText w:val="%4."/>
+      <w:lvlJc w:val="left"/>
+      <w:pPr>
+        <w:ind w:left="2880" w:hanging="360"/>
+      </w:pPr>
+    </w:lvl>
+    <w:lvl w:ilvl="4" w:tplc="04190019" w:tentative="1">
+      <w:start w:val="1"/>
+      <w:numFmt w:val="lowerLetter"/>
+      <w:lvlText w:val="%5."/>
+      <w:lvlJc w:val="left"/>
+      <w:pPr>
+        <w:ind w:left="3600" w:hanging="360"/>
+      </w:pPr>
+    </w:lvl>
+    <w:lvl w:ilvl="5" w:tplc="0419001B" w:tentative="1">
+      <w:start w:val="1"/>
+      <w:numFmt w:val="lowerRoman"/>
+      <w:lvlText w:val="%6."/>
+      <w:lvlJc w:val="right"/>
+      <w:pPr>
+        <w:ind w:left="4320" w:hanging="180"/>
+      </w:pPr>
+    </w:lvl>
+    <w:lvl w:ilvl="6" w:tplc="0419000F" w:tentative="1">
+      <w:start w:val="1"/>
+      <w:numFmt w:val="decimal"/>
+      <w:lvlText w:val="%7."/>
+      <w:lvlJc w:val="left"/>
+      <w:pPr>
+        <w:ind w:left="5040" w:hanging="360"/>
+      </w:pPr>
+    </w:lvl>
+    <w:lvl w:ilvl="7" w:tplc="04190019" w:tentative="1">
+      <w:start w:val="1"/>
+      <w:numFmt w:val="lowerLetter"/>
+      <w:lvlText w:val="%8."/>
+      <w:lvlJc w:val="left"/>
+      <w:pPr>
+        <w:ind w:left="5760" w:hanging="360"/>
+      </w:pPr>
+    </w:lvl>
+    <w:lvl w:ilvl="8" w:tplc="0419001B" w:tentative="1">
+      <w:start w:val="1"/>
+      <w:numFmt w:val="lowerRoman"/>
+      <w:lvlText w:val="%9."/>
+      <w:lvlJc w:val="right"/>
+      <w:pPr>
+        <w:ind w:left="6480" w:hanging="180"/>
+      </w:pPr>
+    </w:lvl>
+  </w:abstractNum>
+  <w:abstractNum w:abstractNumId="10" w15:restartNumberingAfterBreak="0">
     <w:nsid w:val="195878F6"/>
     <w:multiLevelType w:val="hybridMultilevel"/>
     <w:tmpl w:val="B450E8E0"/>
@@ -29526,7 +31933,265 @@
       </w:pPr>
     </w:lvl>
   </w:abstractNum>
-  <w:abstractNum w:abstractNumId="10" w15:restartNumberingAfterBreak="0">
+  <w:abstractNum w:abstractNumId="11" w15:restartNumberingAfterBreak="0">
+    <w:nsid w:val="20EB05A5"/>
+    <w:multiLevelType w:val="hybridMultilevel"/>
+    <w:tmpl w:val="7068E8DA"/>
+    <w:lvl w:ilvl="0" w:tplc="0419000F">
+      <w:start w:val="1"/>
+      <w:numFmt w:val="decimal"/>
+      <w:lvlText w:val="%1."/>
+      <w:lvlJc w:val="left"/>
+      <w:pPr>
+        <w:ind w:left="720" w:hanging="360"/>
+      </w:pPr>
+    </w:lvl>
+    <w:lvl w:ilvl="1" w:tplc="04190019" w:tentative="1">
+      <w:start w:val="1"/>
+      <w:numFmt w:val="lowerLetter"/>
+      <w:lvlText w:val="%2."/>
+      <w:lvlJc w:val="left"/>
+      <w:pPr>
+        <w:ind w:left="1440" w:hanging="360"/>
+      </w:pPr>
+    </w:lvl>
+    <w:lvl w:ilvl="2" w:tplc="0419001B" w:tentative="1">
+      <w:start w:val="1"/>
+      <w:numFmt w:val="lowerRoman"/>
+      <w:lvlText w:val="%3."/>
+      <w:lvlJc w:val="right"/>
+      <w:pPr>
+        <w:ind w:left="2160" w:hanging="180"/>
+      </w:pPr>
+    </w:lvl>
+    <w:lvl w:ilvl="3" w:tplc="0419000F" w:tentative="1">
+      <w:start w:val="1"/>
+      <w:numFmt w:val="decimal"/>
+      <w:lvlText w:val="%4."/>
+      <w:lvlJc w:val="left"/>
+      <w:pPr>
+        <w:ind w:left="2880" w:hanging="360"/>
+      </w:pPr>
+    </w:lvl>
+    <w:lvl w:ilvl="4" w:tplc="04190019" w:tentative="1">
+      <w:start w:val="1"/>
+      <w:numFmt w:val="lowerLetter"/>
+      <w:lvlText w:val="%5."/>
+      <w:lvlJc w:val="left"/>
+      <w:pPr>
+        <w:ind w:left="3600" w:hanging="360"/>
+      </w:pPr>
+    </w:lvl>
+    <w:lvl w:ilvl="5" w:tplc="0419001B" w:tentative="1">
+      <w:start w:val="1"/>
+      <w:numFmt w:val="lowerRoman"/>
+      <w:lvlText w:val="%6."/>
+      <w:lvlJc w:val="right"/>
+      <w:pPr>
+        <w:ind w:left="4320" w:hanging="180"/>
+      </w:pPr>
+    </w:lvl>
+    <w:lvl w:ilvl="6" w:tplc="0419000F" w:tentative="1">
+      <w:start w:val="1"/>
+      <w:numFmt w:val="decimal"/>
+      <w:lvlText w:val="%7."/>
+      <w:lvlJc w:val="left"/>
+      <w:pPr>
+        <w:ind w:left="5040" w:hanging="360"/>
+      </w:pPr>
+    </w:lvl>
+    <w:lvl w:ilvl="7" w:tplc="04190019" w:tentative="1">
+      <w:start w:val="1"/>
+      <w:numFmt w:val="lowerLetter"/>
+      <w:lvlText w:val="%8."/>
+      <w:lvlJc w:val="left"/>
+      <w:pPr>
+        <w:ind w:left="5760" w:hanging="360"/>
+      </w:pPr>
+    </w:lvl>
+    <w:lvl w:ilvl="8" w:tplc="0419001B" w:tentative="1">
+      <w:start w:val="1"/>
+      <w:numFmt w:val="lowerRoman"/>
+      <w:lvlText w:val="%9."/>
+      <w:lvlJc w:val="right"/>
+      <w:pPr>
+        <w:ind w:left="6480" w:hanging="180"/>
+      </w:pPr>
+    </w:lvl>
+  </w:abstractNum>
+  <w:abstractNum w:abstractNumId="12" w15:restartNumberingAfterBreak="0">
+    <w:nsid w:val="24DC391A"/>
+    <w:multiLevelType w:val="hybridMultilevel"/>
+    <w:tmpl w:val="974239F4"/>
+    <w:lvl w:ilvl="0" w:tplc="0419000F">
+      <w:start w:val="1"/>
+      <w:numFmt w:val="decimal"/>
+      <w:lvlText w:val="%1."/>
+      <w:lvlJc w:val="left"/>
+      <w:pPr>
+        <w:ind w:left="720" w:hanging="360"/>
+      </w:pPr>
+    </w:lvl>
+    <w:lvl w:ilvl="1" w:tplc="04190019" w:tentative="1">
+      <w:start w:val="1"/>
+      <w:numFmt w:val="lowerLetter"/>
+      <w:lvlText w:val="%2."/>
+      <w:lvlJc w:val="left"/>
+      <w:pPr>
+        <w:ind w:left="1440" w:hanging="360"/>
+      </w:pPr>
+    </w:lvl>
+    <w:lvl w:ilvl="2" w:tplc="0419001B" w:tentative="1">
+      <w:start w:val="1"/>
+      <w:numFmt w:val="lowerRoman"/>
+      <w:lvlText w:val="%3."/>
+      <w:lvlJc w:val="right"/>
+      <w:pPr>
+        <w:ind w:left="2160" w:hanging="180"/>
+      </w:pPr>
+    </w:lvl>
+    <w:lvl w:ilvl="3" w:tplc="0419000F" w:tentative="1">
+      <w:start w:val="1"/>
+      <w:numFmt w:val="decimal"/>
+      <w:lvlText w:val="%4."/>
+      <w:lvlJc w:val="left"/>
+      <w:pPr>
+        <w:ind w:left="2880" w:hanging="360"/>
+      </w:pPr>
+    </w:lvl>
+    <w:lvl w:ilvl="4" w:tplc="04190019" w:tentative="1">
+      <w:start w:val="1"/>
+      <w:numFmt w:val="lowerLetter"/>
+      <w:lvlText w:val="%5."/>
+      <w:lvlJc w:val="left"/>
+      <w:pPr>
+        <w:ind w:left="3600" w:hanging="360"/>
+      </w:pPr>
+    </w:lvl>
+    <w:lvl w:ilvl="5" w:tplc="0419001B" w:tentative="1">
+      <w:start w:val="1"/>
+      <w:numFmt w:val="lowerRoman"/>
+      <w:lvlText w:val="%6."/>
+      <w:lvlJc w:val="right"/>
+      <w:pPr>
+        <w:ind w:left="4320" w:hanging="180"/>
+      </w:pPr>
+    </w:lvl>
+    <w:lvl w:ilvl="6" w:tplc="0419000F" w:tentative="1">
+      <w:start w:val="1"/>
+      <w:numFmt w:val="decimal"/>
+      <w:lvlText w:val="%7."/>
+      <w:lvlJc w:val="left"/>
+      <w:pPr>
+        <w:ind w:left="5040" w:hanging="360"/>
+      </w:pPr>
+    </w:lvl>
+    <w:lvl w:ilvl="7" w:tplc="04190019" w:tentative="1">
+      <w:start w:val="1"/>
+      <w:numFmt w:val="lowerLetter"/>
+      <w:lvlText w:val="%8."/>
+      <w:lvlJc w:val="left"/>
+      <w:pPr>
+        <w:ind w:left="5760" w:hanging="360"/>
+      </w:pPr>
+    </w:lvl>
+    <w:lvl w:ilvl="8" w:tplc="0419001B" w:tentative="1">
+      <w:start w:val="1"/>
+      <w:numFmt w:val="lowerRoman"/>
+      <w:lvlText w:val="%9."/>
+      <w:lvlJc w:val="right"/>
+      <w:pPr>
+        <w:ind w:left="6480" w:hanging="180"/>
+      </w:pPr>
+    </w:lvl>
+  </w:abstractNum>
+  <w:abstractNum w:abstractNumId="13" w15:restartNumberingAfterBreak="0">
+    <w:nsid w:val="25793D5D"/>
+    <w:multiLevelType w:val="hybridMultilevel"/>
+    <w:tmpl w:val="CC100218"/>
+    <w:lvl w:ilvl="0" w:tplc="0419000F">
+      <w:start w:val="1"/>
+      <w:numFmt w:val="decimal"/>
+      <w:lvlText w:val="%1."/>
+      <w:lvlJc w:val="left"/>
+      <w:pPr>
+        <w:ind w:left="1440" w:hanging="360"/>
+      </w:pPr>
+    </w:lvl>
+    <w:lvl w:ilvl="1" w:tplc="04190019" w:tentative="1">
+      <w:start w:val="1"/>
+      <w:numFmt w:val="lowerLetter"/>
+      <w:lvlText w:val="%2."/>
+      <w:lvlJc w:val="left"/>
+      <w:pPr>
+        <w:ind w:left="2160" w:hanging="360"/>
+      </w:pPr>
+    </w:lvl>
+    <w:lvl w:ilvl="2" w:tplc="0419001B" w:tentative="1">
+      <w:start w:val="1"/>
+      <w:numFmt w:val="lowerRoman"/>
+      <w:lvlText w:val="%3."/>
+      <w:lvlJc w:val="right"/>
+      <w:pPr>
+        <w:ind w:left="2880" w:hanging="180"/>
+      </w:pPr>
+    </w:lvl>
+    <w:lvl w:ilvl="3" w:tplc="0419000F" w:tentative="1">
+      <w:start w:val="1"/>
+      <w:numFmt w:val="decimal"/>
+      <w:lvlText w:val="%4."/>
+      <w:lvlJc w:val="left"/>
+      <w:pPr>
+        <w:ind w:left="3600" w:hanging="360"/>
+      </w:pPr>
+    </w:lvl>
+    <w:lvl w:ilvl="4" w:tplc="04190019" w:tentative="1">
+      <w:start w:val="1"/>
+      <w:numFmt w:val="lowerLetter"/>
+      <w:lvlText w:val="%5."/>
+      <w:lvlJc w:val="left"/>
+      <w:pPr>
+        <w:ind w:left="4320" w:hanging="360"/>
+      </w:pPr>
+    </w:lvl>
+    <w:lvl w:ilvl="5" w:tplc="0419001B" w:tentative="1">
+      <w:start w:val="1"/>
+      <w:numFmt w:val="lowerRoman"/>
+      <w:lvlText w:val="%6."/>
+      <w:lvlJc w:val="right"/>
+      <w:pPr>
+        <w:ind w:left="5040" w:hanging="180"/>
+      </w:pPr>
+    </w:lvl>
+    <w:lvl w:ilvl="6" w:tplc="0419000F" w:tentative="1">
+      <w:start w:val="1"/>
+      <w:numFmt w:val="decimal"/>
+      <w:lvlText w:val="%7."/>
+      <w:lvlJc w:val="left"/>
+      <w:pPr>
+        <w:ind w:left="5760" w:hanging="360"/>
+      </w:pPr>
+    </w:lvl>
+    <w:lvl w:ilvl="7" w:tplc="04190019" w:tentative="1">
+      <w:start w:val="1"/>
+      <w:numFmt w:val="lowerLetter"/>
+      <w:lvlText w:val="%8."/>
+      <w:lvlJc w:val="left"/>
+      <w:pPr>
+        <w:ind w:left="6480" w:hanging="360"/>
+      </w:pPr>
+    </w:lvl>
+    <w:lvl w:ilvl="8" w:tplc="0419001B" w:tentative="1">
+      <w:start w:val="1"/>
+      <w:numFmt w:val="lowerRoman"/>
+      <w:lvlText w:val="%9."/>
+      <w:lvlJc w:val="right"/>
+      <w:pPr>
+        <w:ind w:left="7200" w:hanging="180"/>
+      </w:pPr>
+    </w:lvl>
+  </w:abstractNum>
+  <w:abstractNum w:abstractNumId="14" w15:restartNumberingAfterBreak="0">
     <w:nsid w:val="25E62212"/>
     <w:multiLevelType w:val="hybridMultilevel"/>
     <w:tmpl w:val="956842D8"/>
@@ -29639,7 +32304,7 @@
       </w:rPr>
     </w:lvl>
   </w:abstractNum>
-  <w:abstractNum w:abstractNumId="11" w15:restartNumberingAfterBreak="0">
+  <w:abstractNum w:abstractNumId="15" w15:restartNumberingAfterBreak="0">
     <w:nsid w:val="26401BCF"/>
     <w:multiLevelType w:val="hybridMultilevel"/>
     <w:tmpl w:val="15C442A0"/>
@@ -29752,7 +32417,7 @@
       </w:rPr>
     </w:lvl>
   </w:abstractNum>
-  <w:abstractNum w:abstractNumId="12" w15:restartNumberingAfterBreak="0">
+  <w:abstractNum w:abstractNumId="16" w15:restartNumberingAfterBreak="0">
     <w:nsid w:val="2F534106"/>
     <w:multiLevelType w:val="hybridMultilevel"/>
     <w:tmpl w:val="7D106F56"/>
@@ -29838,7 +32503,7 @@
       </w:pPr>
     </w:lvl>
   </w:abstractNum>
-  <w:abstractNum w:abstractNumId="13" w15:restartNumberingAfterBreak="0">
+  <w:abstractNum w:abstractNumId="17" w15:restartNumberingAfterBreak="0">
     <w:nsid w:val="368C49BE"/>
     <w:multiLevelType w:val="hybridMultilevel"/>
     <w:tmpl w:val="A90E1BC4"/>
@@ -29924,7 +32589,7 @@
       </w:pPr>
     </w:lvl>
   </w:abstractNum>
-  <w:abstractNum w:abstractNumId="14" w15:restartNumberingAfterBreak="0">
+  <w:abstractNum w:abstractNumId="18" w15:restartNumberingAfterBreak="0">
     <w:nsid w:val="3AB278F1"/>
     <w:multiLevelType w:val="hybridMultilevel"/>
     <w:tmpl w:val="2E3E46A0"/>
@@ -30037,7 +32702,7 @@
       </w:rPr>
     </w:lvl>
   </w:abstractNum>
-  <w:abstractNum w:abstractNumId="15" w15:restartNumberingAfterBreak="0">
+  <w:abstractNum w:abstractNumId="19" w15:restartNumberingAfterBreak="0">
     <w:nsid w:val="3BC77193"/>
     <w:multiLevelType w:val="multilevel"/>
     <w:tmpl w:val="C9F8ABC2"/>
@@ -30150,7 +32815,93 @@
       </w:pPr>
     </w:lvl>
   </w:abstractNum>
-  <w:abstractNum w:abstractNumId="16" w15:restartNumberingAfterBreak="0">
+  <w:abstractNum w:abstractNumId="20" w15:restartNumberingAfterBreak="0">
+    <w:nsid w:val="3FE16ED3"/>
+    <w:multiLevelType w:val="hybridMultilevel"/>
+    <w:tmpl w:val="A4C48CA4"/>
+    <w:lvl w:ilvl="0" w:tplc="0419000F">
+      <w:start w:val="1"/>
+      <w:numFmt w:val="decimal"/>
+      <w:lvlText w:val="%1."/>
+      <w:lvlJc w:val="left"/>
+      <w:pPr>
+        <w:ind w:left="720" w:hanging="360"/>
+      </w:pPr>
+    </w:lvl>
+    <w:lvl w:ilvl="1" w:tplc="04190019" w:tentative="1">
+      <w:start w:val="1"/>
+      <w:numFmt w:val="lowerLetter"/>
+      <w:lvlText w:val="%2."/>
+      <w:lvlJc w:val="left"/>
+      <w:pPr>
+        <w:ind w:left="1440" w:hanging="360"/>
+      </w:pPr>
+    </w:lvl>
+    <w:lvl w:ilvl="2" w:tplc="0419001B" w:tentative="1">
+      <w:start w:val="1"/>
+      <w:numFmt w:val="lowerRoman"/>
+      <w:lvlText w:val="%3."/>
+      <w:lvlJc w:val="right"/>
+      <w:pPr>
+        <w:ind w:left="2160" w:hanging="180"/>
+      </w:pPr>
+    </w:lvl>
+    <w:lvl w:ilvl="3" w:tplc="0419000F" w:tentative="1">
+      <w:start w:val="1"/>
+      <w:numFmt w:val="decimal"/>
+      <w:lvlText w:val="%4."/>
+      <w:lvlJc w:val="left"/>
+      <w:pPr>
+        <w:ind w:left="2880" w:hanging="360"/>
+      </w:pPr>
+    </w:lvl>
+    <w:lvl w:ilvl="4" w:tplc="04190019" w:tentative="1">
+      <w:start w:val="1"/>
+      <w:numFmt w:val="lowerLetter"/>
+      <w:lvlText w:val="%5."/>
+      <w:lvlJc w:val="left"/>
+      <w:pPr>
+        <w:ind w:left="3600" w:hanging="360"/>
+      </w:pPr>
+    </w:lvl>
+    <w:lvl w:ilvl="5" w:tplc="0419001B" w:tentative="1">
+      <w:start w:val="1"/>
+      <w:numFmt w:val="lowerRoman"/>
+      <w:lvlText w:val="%6."/>
+      <w:lvlJc w:val="right"/>
+      <w:pPr>
+        <w:ind w:left="4320" w:hanging="180"/>
+      </w:pPr>
+    </w:lvl>
+    <w:lvl w:ilvl="6" w:tplc="0419000F" w:tentative="1">
+      <w:start w:val="1"/>
+      <w:numFmt w:val="decimal"/>
+      <w:lvlText w:val="%7."/>
+      <w:lvlJc w:val="left"/>
+      <w:pPr>
+        <w:ind w:left="5040" w:hanging="360"/>
+      </w:pPr>
+    </w:lvl>
+    <w:lvl w:ilvl="7" w:tplc="04190019" w:tentative="1">
+      <w:start w:val="1"/>
+      <w:numFmt w:val="lowerLetter"/>
+      <w:lvlText w:val="%8."/>
+      <w:lvlJc w:val="left"/>
+      <w:pPr>
+        <w:ind w:left="5760" w:hanging="360"/>
+      </w:pPr>
+    </w:lvl>
+    <w:lvl w:ilvl="8" w:tplc="0419001B" w:tentative="1">
+      <w:start w:val="1"/>
+      <w:numFmt w:val="lowerRoman"/>
+      <w:lvlText w:val="%9."/>
+      <w:lvlJc w:val="right"/>
+      <w:pPr>
+        <w:ind w:left="6480" w:hanging="180"/>
+      </w:pPr>
+    </w:lvl>
+  </w:abstractNum>
+  <w:abstractNum w:abstractNumId="21" w15:restartNumberingAfterBreak="0">
     <w:nsid w:val="403A2665"/>
     <w:multiLevelType w:val="multilevel"/>
     <w:tmpl w:val="65DE7CB0"/>
@@ -30299,7 +33050,93 @@
       </w:rPr>
     </w:lvl>
   </w:abstractNum>
-  <w:abstractNum w:abstractNumId="17" w15:restartNumberingAfterBreak="0">
+  <w:abstractNum w:abstractNumId="22" w15:restartNumberingAfterBreak="0">
+    <w:nsid w:val="41EC3C1A"/>
+    <w:multiLevelType w:val="hybridMultilevel"/>
+    <w:tmpl w:val="066A926C"/>
+    <w:lvl w:ilvl="0" w:tplc="0419000F">
+      <w:start w:val="1"/>
+      <w:numFmt w:val="decimal"/>
+      <w:lvlText w:val="%1."/>
+      <w:lvlJc w:val="left"/>
+      <w:pPr>
+        <w:ind w:left="720" w:hanging="360"/>
+      </w:pPr>
+    </w:lvl>
+    <w:lvl w:ilvl="1" w:tplc="04190019" w:tentative="1">
+      <w:start w:val="1"/>
+      <w:numFmt w:val="lowerLetter"/>
+      <w:lvlText w:val="%2."/>
+      <w:lvlJc w:val="left"/>
+      <w:pPr>
+        <w:ind w:left="1440" w:hanging="360"/>
+      </w:pPr>
+    </w:lvl>
+    <w:lvl w:ilvl="2" w:tplc="0419001B" w:tentative="1">
+      <w:start w:val="1"/>
+      <w:numFmt w:val="lowerRoman"/>
+      <w:lvlText w:val="%3."/>
+      <w:lvlJc w:val="right"/>
+      <w:pPr>
+        <w:ind w:left="2160" w:hanging="180"/>
+      </w:pPr>
+    </w:lvl>
+    <w:lvl w:ilvl="3" w:tplc="0419000F" w:tentative="1">
+      <w:start w:val="1"/>
+      <w:numFmt w:val="decimal"/>
+      <w:lvlText w:val="%4."/>
+      <w:lvlJc w:val="left"/>
+      <w:pPr>
+        <w:ind w:left="2880" w:hanging="360"/>
+      </w:pPr>
+    </w:lvl>
+    <w:lvl w:ilvl="4" w:tplc="04190019" w:tentative="1">
+      <w:start w:val="1"/>
+      <w:numFmt w:val="lowerLetter"/>
+      <w:lvlText w:val="%5."/>
+      <w:lvlJc w:val="left"/>
+      <w:pPr>
+        <w:ind w:left="3600" w:hanging="360"/>
+      </w:pPr>
+    </w:lvl>
+    <w:lvl w:ilvl="5" w:tplc="0419001B" w:tentative="1">
+      <w:start w:val="1"/>
+      <w:numFmt w:val="lowerRoman"/>
+      <w:lvlText w:val="%6."/>
+      <w:lvlJc w:val="right"/>
+      <w:pPr>
+        <w:ind w:left="4320" w:hanging="180"/>
+      </w:pPr>
+    </w:lvl>
+    <w:lvl w:ilvl="6" w:tplc="0419000F" w:tentative="1">
+      <w:start w:val="1"/>
+      <w:numFmt w:val="decimal"/>
+      <w:lvlText w:val="%7."/>
+      <w:lvlJc w:val="left"/>
+      <w:pPr>
+        <w:ind w:left="5040" w:hanging="360"/>
+      </w:pPr>
+    </w:lvl>
+    <w:lvl w:ilvl="7" w:tplc="04190019" w:tentative="1">
+      <w:start w:val="1"/>
+      <w:numFmt w:val="lowerLetter"/>
+      <w:lvlText w:val="%8."/>
+      <w:lvlJc w:val="left"/>
+      <w:pPr>
+        <w:ind w:left="5760" w:hanging="360"/>
+      </w:pPr>
+    </w:lvl>
+    <w:lvl w:ilvl="8" w:tplc="0419001B" w:tentative="1">
+      <w:start w:val="1"/>
+      <w:numFmt w:val="lowerRoman"/>
+      <w:lvlText w:val="%9."/>
+      <w:lvlJc w:val="right"/>
+      <w:pPr>
+        <w:ind w:left="6480" w:hanging="180"/>
+      </w:pPr>
+    </w:lvl>
+  </w:abstractNum>
+  <w:abstractNum w:abstractNumId="23" w15:restartNumberingAfterBreak="0">
     <w:nsid w:val="46211DB1"/>
     <w:multiLevelType w:val="multilevel"/>
     <w:tmpl w:val="79C60E9C"/>
@@ -30412,7 +33249,7 @@
       </w:pPr>
     </w:lvl>
   </w:abstractNum>
-  <w:abstractNum w:abstractNumId="18" w15:restartNumberingAfterBreak="0">
+  <w:abstractNum w:abstractNumId="24" w15:restartNumberingAfterBreak="0">
     <w:nsid w:val="48BC13FA"/>
     <w:multiLevelType w:val="multilevel"/>
     <w:tmpl w:val="2B8CF892"/>
@@ -30561,7 +33398,7 @@
       </w:rPr>
     </w:lvl>
   </w:abstractNum>
-  <w:abstractNum w:abstractNumId="19" w15:restartNumberingAfterBreak="0">
+  <w:abstractNum w:abstractNumId="25" w15:restartNumberingAfterBreak="0">
     <w:nsid w:val="4A987FE2"/>
     <w:multiLevelType w:val="hybridMultilevel"/>
     <w:tmpl w:val="98FEC348"/>
@@ -30647,7 +33484,7 @@
       </w:pPr>
     </w:lvl>
   </w:abstractNum>
-  <w:abstractNum w:abstractNumId="20" w15:restartNumberingAfterBreak="0">
+  <w:abstractNum w:abstractNumId="26" w15:restartNumberingAfterBreak="0">
     <w:nsid w:val="4AD470CF"/>
     <w:multiLevelType w:val="multilevel"/>
     <w:tmpl w:val="10D2C75A"/>
@@ -30760,7 +33597,7 @@
       </w:pPr>
     </w:lvl>
   </w:abstractNum>
-  <w:abstractNum w:abstractNumId="21" w15:restartNumberingAfterBreak="0">
+  <w:abstractNum w:abstractNumId="27" w15:restartNumberingAfterBreak="0">
     <w:nsid w:val="4E717873"/>
     <w:multiLevelType w:val="hybridMultilevel"/>
     <w:tmpl w:val="556EC60C"/>
@@ -30846,7 +33683,93 @@
       </w:pPr>
     </w:lvl>
   </w:abstractNum>
-  <w:abstractNum w:abstractNumId="22" w15:restartNumberingAfterBreak="0">
+  <w:abstractNum w:abstractNumId="28" w15:restartNumberingAfterBreak="0">
+    <w:nsid w:val="4FD86565"/>
+    <w:multiLevelType w:val="hybridMultilevel"/>
+    <w:tmpl w:val="33489F7E"/>
+    <w:lvl w:ilvl="0" w:tplc="0419000F">
+      <w:start w:val="1"/>
+      <w:numFmt w:val="decimal"/>
+      <w:lvlText w:val="%1."/>
+      <w:lvlJc w:val="left"/>
+      <w:pPr>
+        <w:ind w:left="1440" w:hanging="360"/>
+      </w:pPr>
+    </w:lvl>
+    <w:lvl w:ilvl="1" w:tplc="04190019" w:tentative="1">
+      <w:start w:val="1"/>
+      <w:numFmt w:val="lowerLetter"/>
+      <w:lvlText w:val="%2."/>
+      <w:lvlJc w:val="left"/>
+      <w:pPr>
+        <w:ind w:left="2160" w:hanging="360"/>
+      </w:pPr>
+    </w:lvl>
+    <w:lvl w:ilvl="2" w:tplc="0419001B" w:tentative="1">
+      <w:start w:val="1"/>
+      <w:numFmt w:val="lowerRoman"/>
+      <w:lvlText w:val="%3."/>
+      <w:lvlJc w:val="right"/>
+      <w:pPr>
+        <w:ind w:left="2880" w:hanging="180"/>
+      </w:pPr>
+    </w:lvl>
+    <w:lvl w:ilvl="3" w:tplc="0419000F" w:tentative="1">
+      <w:start w:val="1"/>
+      <w:numFmt w:val="decimal"/>
+      <w:lvlText w:val="%4."/>
+      <w:lvlJc w:val="left"/>
+      <w:pPr>
+        <w:ind w:left="3600" w:hanging="360"/>
+      </w:pPr>
+    </w:lvl>
+    <w:lvl w:ilvl="4" w:tplc="04190019" w:tentative="1">
+      <w:start w:val="1"/>
+      <w:numFmt w:val="lowerLetter"/>
+      <w:lvlText w:val="%5."/>
+      <w:lvlJc w:val="left"/>
+      <w:pPr>
+        <w:ind w:left="4320" w:hanging="360"/>
+      </w:pPr>
+    </w:lvl>
+    <w:lvl w:ilvl="5" w:tplc="0419001B" w:tentative="1">
+      <w:start w:val="1"/>
+      <w:numFmt w:val="lowerRoman"/>
+      <w:lvlText w:val="%6."/>
+      <w:lvlJc w:val="right"/>
+      <w:pPr>
+        <w:ind w:left="5040" w:hanging="180"/>
+      </w:pPr>
+    </w:lvl>
+    <w:lvl w:ilvl="6" w:tplc="0419000F" w:tentative="1">
+      <w:start w:val="1"/>
+      <w:numFmt w:val="decimal"/>
+      <w:lvlText w:val="%7."/>
+      <w:lvlJc w:val="left"/>
+      <w:pPr>
+        <w:ind w:left="5760" w:hanging="360"/>
+      </w:pPr>
+    </w:lvl>
+    <w:lvl w:ilvl="7" w:tplc="04190019" w:tentative="1">
+      <w:start w:val="1"/>
+      <w:numFmt w:val="lowerLetter"/>
+      <w:lvlText w:val="%8."/>
+      <w:lvlJc w:val="left"/>
+      <w:pPr>
+        <w:ind w:left="6480" w:hanging="360"/>
+      </w:pPr>
+    </w:lvl>
+    <w:lvl w:ilvl="8" w:tplc="0419001B" w:tentative="1">
+      <w:start w:val="1"/>
+      <w:numFmt w:val="lowerRoman"/>
+      <w:lvlText w:val="%9."/>
+      <w:lvlJc w:val="right"/>
+      <w:pPr>
+        <w:ind w:left="7200" w:hanging="180"/>
+      </w:pPr>
+    </w:lvl>
+  </w:abstractNum>
+  <w:abstractNum w:abstractNumId="29" w15:restartNumberingAfterBreak="0">
     <w:nsid w:val="50E5313E"/>
     <w:multiLevelType w:val="multilevel"/>
     <w:tmpl w:val="BD260A06"/>
@@ -30959,7 +33882,7 @@
       </w:pPr>
     </w:lvl>
   </w:abstractNum>
-  <w:abstractNum w:abstractNumId="23" w15:restartNumberingAfterBreak="0">
+  <w:abstractNum w:abstractNumId="30" w15:restartNumberingAfterBreak="0">
     <w:nsid w:val="5122402B"/>
     <w:multiLevelType w:val="hybridMultilevel"/>
     <w:tmpl w:val="DB1A1152"/>
@@ -31045,7 +33968,7 @@
       </w:pPr>
     </w:lvl>
   </w:abstractNum>
-  <w:abstractNum w:abstractNumId="24" w15:restartNumberingAfterBreak="0">
+  <w:abstractNum w:abstractNumId="31" w15:restartNumberingAfterBreak="0">
     <w:nsid w:val="52C22F3C"/>
     <w:multiLevelType w:val="hybridMultilevel"/>
     <w:tmpl w:val="B27CBA48"/>
@@ -31131,7 +34054,7 @@
       </w:pPr>
     </w:lvl>
   </w:abstractNum>
-  <w:abstractNum w:abstractNumId="25" w15:restartNumberingAfterBreak="0">
+  <w:abstractNum w:abstractNumId="32" w15:restartNumberingAfterBreak="0">
     <w:nsid w:val="56F838EA"/>
     <w:multiLevelType w:val="hybridMultilevel"/>
     <w:tmpl w:val="45B6AC08"/>
@@ -31217,7 +34140,7 @@
       </w:pPr>
     </w:lvl>
   </w:abstractNum>
-  <w:abstractNum w:abstractNumId="26" w15:restartNumberingAfterBreak="0">
+  <w:abstractNum w:abstractNumId="33" w15:restartNumberingAfterBreak="0">
     <w:nsid w:val="5BCF5B6B"/>
     <w:multiLevelType w:val="hybridMultilevel"/>
     <w:tmpl w:val="9D4CDC56"/>
@@ -31303,7 +34226,7 @@
       </w:pPr>
     </w:lvl>
   </w:abstractNum>
-  <w:abstractNum w:abstractNumId="27" w15:restartNumberingAfterBreak="0">
+  <w:abstractNum w:abstractNumId="34" w15:restartNumberingAfterBreak="0">
     <w:nsid w:val="5CC12EA0"/>
     <w:multiLevelType w:val="multilevel"/>
     <w:tmpl w:val="C87E2078"/>
@@ -31452,7 +34375,7 @@
       </w:rPr>
     </w:lvl>
   </w:abstractNum>
-  <w:abstractNum w:abstractNumId="28" w15:restartNumberingAfterBreak="0">
+  <w:abstractNum w:abstractNumId="35" w15:restartNumberingAfterBreak="0">
     <w:nsid w:val="5E6936F1"/>
     <w:multiLevelType w:val="multilevel"/>
     <w:tmpl w:val="114E4AD8"/>
@@ -31565,7 +34488,93 @@
       </w:pPr>
     </w:lvl>
   </w:abstractNum>
-  <w:abstractNum w:abstractNumId="29" w15:restartNumberingAfterBreak="0">
+  <w:abstractNum w:abstractNumId="36" w15:restartNumberingAfterBreak="0">
+    <w:nsid w:val="5F3E1264"/>
+    <w:multiLevelType w:val="hybridMultilevel"/>
+    <w:tmpl w:val="805E3B42"/>
+    <w:lvl w:ilvl="0" w:tplc="0419000F">
+      <w:start w:val="1"/>
+      <w:numFmt w:val="decimal"/>
+      <w:lvlText w:val="%1."/>
+      <w:lvlJc w:val="left"/>
+      <w:pPr>
+        <w:ind w:left="1440" w:hanging="360"/>
+      </w:pPr>
+    </w:lvl>
+    <w:lvl w:ilvl="1" w:tplc="04190019" w:tentative="1">
+      <w:start w:val="1"/>
+      <w:numFmt w:val="lowerLetter"/>
+      <w:lvlText w:val="%2."/>
+      <w:lvlJc w:val="left"/>
+      <w:pPr>
+        <w:ind w:left="2160" w:hanging="360"/>
+      </w:pPr>
+    </w:lvl>
+    <w:lvl w:ilvl="2" w:tplc="0419001B" w:tentative="1">
+      <w:start w:val="1"/>
+      <w:numFmt w:val="lowerRoman"/>
+      <w:lvlText w:val="%3."/>
+      <w:lvlJc w:val="right"/>
+      <w:pPr>
+        <w:ind w:left="2880" w:hanging="180"/>
+      </w:pPr>
+    </w:lvl>
+    <w:lvl w:ilvl="3" w:tplc="0419000F" w:tentative="1">
+      <w:start w:val="1"/>
+      <w:numFmt w:val="decimal"/>
+      <w:lvlText w:val="%4."/>
+      <w:lvlJc w:val="left"/>
+      <w:pPr>
+        <w:ind w:left="3600" w:hanging="360"/>
+      </w:pPr>
+    </w:lvl>
+    <w:lvl w:ilvl="4" w:tplc="04190019" w:tentative="1">
+      <w:start w:val="1"/>
+      <w:numFmt w:val="lowerLetter"/>
+      <w:lvlText w:val="%5."/>
+      <w:lvlJc w:val="left"/>
+      <w:pPr>
+        <w:ind w:left="4320" w:hanging="360"/>
+      </w:pPr>
+    </w:lvl>
+    <w:lvl w:ilvl="5" w:tplc="0419001B" w:tentative="1">
+      <w:start w:val="1"/>
+      <w:numFmt w:val="lowerRoman"/>
+      <w:lvlText w:val="%6."/>
+      <w:lvlJc w:val="right"/>
+      <w:pPr>
+        <w:ind w:left="5040" w:hanging="180"/>
+      </w:pPr>
+    </w:lvl>
+    <w:lvl w:ilvl="6" w:tplc="0419000F" w:tentative="1">
+      <w:start w:val="1"/>
+      <w:numFmt w:val="decimal"/>
+      <w:lvlText w:val="%7."/>
+      <w:lvlJc w:val="left"/>
+      <w:pPr>
+        <w:ind w:left="5760" w:hanging="360"/>
+      </w:pPr>
+    </w:lvl>
+    <w:lvl w:ilvl="7" w:tplc="04190019" w:tentative="1">
+      <w:start w:val="1"/>
+      <w:numFmt w:val="lowerLetter"/>
+      <w:lvlText w:val="%8."/>
+      <w:lvlJc w:val="left"/>
+      <w:pPr>
+        <w:ind w:left="6480" w:hanging="360"/>
+      </w:pPr>
+    </w:lvl>
+    <w:lvl w:ilvl="8" w:tplc="0419001B" w:tentative="1">
+      <w:start w:val="1"/>
+      <w:numFmt w:val="lowerRoman"/>
+      <w:lvlText w:val="%9."/>
+      <w:lvlJc w:val="right"/>
+      <w:pPr>
+        <w:ind w:left="7200" w:hanging="180"/>
+      </w:pPr>
+    </w:lvl>
+  </w:abstractNum>
+  <w:abstractNum w:abstractNumId="37" w15:restartNumberingAfterBreak="0">
     <w:nsid w:val="641D0308"/>
     <w:multiLevelType w:val="hybridMultilevel"/>
     <w:tmpl w:val="13784984"/>
@@ -31651,7 +34660,7 @@
       </w:pPr>
     </w:lvl>
   </w:abstractNum>
-  <w:abstractNum w:abstractNumId="30" w15:restartNumberingAfterBreak="0">
+  <w:abstractNum w:abstractNumId="38" w15:restartNumberingAfterBreak="0">
     <w:nsid w:val="64CB1A92"/>
     <w:multiLevelType w:val="hybridMultilevel"/>
     <w:tmpl w:val="17B84478"/>
@@ -31737,7 +34746,7 @@
       </w:pPr>
     </w:lvl>
   </w:abstractNum>
-  <w:abstractNum w:abstractNumId="31" w15:restartNumberingAfterBreak="0">
+  <w:abstractNum w:abstractNumId="39" w15:restartNumberingAfterBreak="0">
     <w:nsid w:val="64F848E8"/>
     <w:multiLevelType w:val="multilevel"/>
     <w:tmpl w:val="54025800"/>
@@ -31850,7 +34859,7 @@
       </w:pPr>
     </w:lvl>
   </w:abstractNum>
-  <w:abstractNum w:abstractNumId="32" w15:restartNumberingAfterBreak="0">
+  <w:abstractNum w:abstractNumId="40" w15:restartNumberingAfterBreak="0">
     <w:nsid w:val="65565DB0"/>
     <w:multiLevelType w:val="multilevel"/>
     <w:tmpl w:val="C2C47A3C"/>
@@ -31963,7 +34972,7 @@
       </w:pPr>
     </w:lvl>
   </w:abstractNum>
-  <w:abstractNum w:abstractNumId="33" w15:restartNumberingAfterBreak="0">
+  <w:abstractNum w:abstractNumId="41" w15:restartNumberingAfterBreak="0">
     <w:nsid w:val="7C26049C"/>
     <w:multiLevelType w:val="hybridMultilevel"/>
     <w:tmpl w:val="1D906DAA"/>
@@ -32050,7 +35059,7 @@
     </w:lvl>
   </w:abstractNum>
   <w:num w:numId="1">
-    <w:abstractNumId w:val="11"/>
+    <w:abstractNumId w:val="15"/>
   </w:num>
   <w:num w:numId="2">
     <w:abstractNumId w:val="1"/>
@@ -32059,19 +35068,19 @@
     <w:abstractNumId w:val="2"/>
   </w:num>
   <w:num w:numId="4">
-    <w:abstractNumId w:val="10"/>
+    <w:abstractNumId w:val="14"/>
   </w:num>
   <w:num w:numId="5">
-    <w:abstractNumId w:val="27"/>
+    <w:abstractNumId w:val="34"/>
   </w:num>
   <w:num w:numId="6">
     <w:abstractNumId w:val="5"/>
   </w:num>
   <w:num w:numId="7">
-    <w:abstractNumId w:val="18"/>
+    <w:abstractNumId w:val="24"/>
   </w:num>
   <w:num w:numId="8">
-    <w:abstractNumId w:val="16"/>
+    <w:abstractNumId w:val="21"/>
   </w:num>
   <w:num w:numId="9">
     <w:abstractNumId w:val="4"/>
@@ -32083,73 +35092,97 @@
     <w:abstractNumId w:val="7"/>
   </w:num>
   <w:num w:numId="12">
-    <w:abstractNumId w:val="14"/>
+    <w:abstractNumId w:val="18"/>
   </w:num>
   <w:num w:numId="13">
-    <w:abstractNumId w:val="21"/>
+    <w:abstractNumId w:val="27"/>
   </w:num>
   <w:num w:numId="14">
-    <w:abstractNumId w:val="30"/>
+    <w:abstractNumId w:val="38"/>
   </w:num>
   <w:num w:numId="15">
-    <w:abstractNumId w:val="24"/>
+    <w:abstractNumId w:val="31"/>
   </w:num>
   <w:num w:numId="16">
-    <w:abstractNumId w:val="13"/>
+    <w:abstractNumId w:val="17"/>
   </w:num>
   <w:num w:numId="17">
-    <w:abstractNumId w:val="26"/>
+    <w:abstractNumId w:val="33"/>
   </w:num>
   <w:num w:numId="18">
-    <w:abstractNumId w:val="12"/>
+    <w:abstractNumId w:val="16"/>
   </w:num>
   <w:num w:numId="19">
-    <w:abstractNumId w:val="19"/>
+    <w:abstractNumId w:val="25"/>
   </w:num>
   <w:num w:numId="20">
-    <w:abstractNumId w:val="33"/>
+    <w:abstractNumId w:val="41"/>
   </w:num>
   <w:num w:numId="21">
     <w:abstractNumId w:val="6"/>
   </w:num>
   <w:num w:numId="22">
-    <w:abstractNumId w:val="29"/>
+    <w:abstractNumId w:val="37"/>
   </w:num>
   <w:num w:numId="23">
-    <w:abstractNumId w:val="25"/>
+    <w:abstractNumId w:val="32"/>
   </w:num>
   <w:num w:numId="24">
-    <w:abstractNumId w:val="23"/>
+    <w:abstractNumId w:val="30"/>
   </w:num>
   <w:num w:numId="25">
     <w:abstractNumId w:val="3"/>
   </w:num>
   <w:num w:numId="26">
-    <w:abstractNumId w:val="9"/>
+    <w:abstractNumId w:val="10"/>
   </w:num>
   <w:num w:numId="27">
-    <w:abstractNumId w:val="20"/>
+    <w:abstractNumId w:val="26"/>
   </w:num>
   <w:num w:numId="28">
-    <w:abstractNumId w:val="15"/>
+    <w:abstractNumId w:val="19"/>
   </w:num>
   <w:num w:numId="29">
-    <w:abstractNumId w:val="28"/>
+    <w:abstractNumId w:val="35"/>
   </w:num>
   <w:num w:numId="30">
-    <w:abstractNumId w:val="22"/>
+    <w:abstractNumId w:val="29"/>
   </w:num>
   <w:num w:numId="31">
-    <w:abstractNumId w:val="31"/>
+    <w:abstractNumId w:val="39"/>
   </w:num>
   <w:num w:numId="32">
-    <w:abstractNumId w:val="17"/>
+    <w:abstractNumId w:val="23"/>
   </w:num>
   <w:num w:numId="33">
-    <w:abstractNumId w:val="32"/>
+    <w:abstractNumId w:val="40"/>
   </w:num>
   <w:num w:numId="34">
     <w:abstractNumId w:val="0"/>
+  </w:num>
+  <w:num w:numId="35">
+    <w:abstractNumId w:val="36"/>
+  </w:num>
+  <w:num w:numId="36">
+    <w:abstractNumId w:val="9"/>
+  </w:num>
+  <w:num w:numId="37">
+    <w:abstractNumId w:val="13"/>
+  </w:num>
+  <w:num w:numId="38">
+    <w:abstractNumId w:val="20"/>
+  </w:num>
+  <w:num w:numId="39">
+    <w:abstractNumId w:val="22"/>
+  </w:num>
+  <w:num w:numId="40">
+    <w:abstractNumId w:val="11"/>
+  </w:num>
+  <w:num w:numId="41">
+    <w:abstractNumId w:val="28"/>
+  </w:num>
+  <w:num w:numId="42">
+    <w:abstractNumId w:val="12"/>
   </w:num>
   <w:numIdMacAtCleanup w:val="33"/>
 </w:numbering>

</xml_diff>